<commit_message>
Updated design guide. Getting documents reorganized into Word.
</commit_message>
<xml_diff>
--- a/Documentation/Design_Style_Guide.docx
+++ b/Documentation/Design_Style_Guide.docx
@@ -3,10 +3,25 @@
 <w:document xmlns:wpc="http://schemas.microsoft.com/office/word/2010/wordprocessingCanvas" xmlns:cx="http://schemas.microsoft.com/office/drawing/2014/chartex" xmlns:cx1="http://schemas.microsoft.com/office/drawing/2015/9/8/chartex" xmlns:cx2="http://schemas.microsoft.com/office/drawing/2015/10/21/chartex" xmlns:cx3="http://schemas.microsoft.com/office/drawing/2016/5/9/chartex" xmlns:cx4="http://schemas.microsoft.com/office/drawing/2016/5/10/chartex" xmlns:cx5="http://schemas.microsoft.com/office/drawing/2016/5/11/chartex" xmlns:cx6="http://schemas.microsoft.com/office/drawing/2016/5/12/chartex" xmlns:cx7="http://schemas.microsoft.com/office/drawing/2016/5/13/chartex" xmlns:cx8="http://schemas.microsoft.com/office/drawing/2016/5/14/chartex" xmlns:mc="http://schemas.openxmlformats.org/markup-compatibility/2006" xmlns:aink="http://schemas.microsoft.com/office/drawing/2016/ink" xmlns:am3d="http://schemas.microsoft.com/office/drawing/2017/model3d" xmlns:o="urn:schemas-microsoft-com:office:office" xmlns:oel="http://schemas.microsoft.com/office/2019/extlst" xmlns:r="http://schemas.openxmlformats.org/officeDocument/2006/relationships" xmlns:m="http://schemas.openxmlformats.org/officeDocument/2006/math" xmlns:v="urn:schemas-microsoft-com:vml" xmlns:wp14="http://schemas.microsoft.com/office/word/2010/wordprocessingDrawing" xmlns:wp="http://schemas.openxmlformats.org/drawingml/2006/wordprocessingDrawing" xmlns:w10="urn:schemas-microsoft-com:office:word" xmlns:w="http://schemas.openxmlformats.org/wordprocessingml/2006/main" xmlns:w14="http://schemas.microsoft.com/office/word/2010/wordml" xmlns:w15="http://schemas.microsoft.com/office/word/2012/wordml" xmlns:w16cex="http://schemas.microsoft.com/office/word/2018/wordml/cex" xmlns:w16cid="http://schemas.microsoft.com/office/word/2016/wordml/cid" xmlns:w16="http://schemas.microsoft.com/office/word/2018/wordml" xmlns:w16du="http://schemas.microsoft.com/office/word/2023/wordml/word16du" xmlns:w16sdtdh="http://schemas.microsoft.com/office/word/2020/wordml/sdtdatahash" xmlns:w16sdtfl="http://schemas.microsoft.com/office/word/2024/wordml/sdtformatlock" xmlns:w16se="http://schemas.microsoft.com/office/word/2015/wordml/symex" xmlns:wpg="http://schemas.microsoft.com/office/word/2010/wordprocessingGroup" xmlns:wpi="http://schemas.microsoft.com/office/word/2010/wordprocessingInk" xmlns:wne="http://schemas.microsoft.com/office/word/2006/wordml" xmlns:wps="http://schemas.microsoft.com/office/word/2010/wordprocessingShape" mc:Ignorable="w14 w15 w16se w16cid w16 w16cex w16sdtdh w16sdtfl w16du wp14">
   <w:body>
     <w:p>
-      <w:r>
+      <w:pPr>
+        <w:rPr>
+          <w:b/>
+          <w:bCs/>
+          <w:sz w:val="36"/>
+          <w:szCs w:val="36"/>
+        </w:rPr>
+      </w:pPr>
+      <w:r>
+        <w:rPr>
+          <w:b/>
+          <w:bCs/>
+          <w:sz w:val="36"/>
+          <w:szCs w:val="36"/>
+        </w:rPr>
         <w:t>Design and Style Guide for the Project</w:t>
       </w:r>
     </w:p>
+    <w:p/>
     <w:p>
       <w:r>
         <w:t>This guide outlines the design principles, color schemes, typography, and reusable components based on the provided CSS file. It serves as a reference for maintaining consistency across the project.</w:t>
@@ -19,56 +34,248 @@
       </w:r>
     </w:p>
     <w:p>
-      <w:r>
+      <w:pPr>
+        <w:rPr>
+          <w:b/>
+          <w:bCs/>
+        </w:rPr>
+      </w:pPr>
+      <w:r>
+        <w:rPr>
+          <w:b/>
+          <w:bCs/>
+        </w:rPr>
         <w:t>1. General Design Principles</w:t>
       </w:r>
     </w:p>
     <w:p>
       <w:r>
+        <w:rPr>
+          <w:noProof/>
+        </w:rPr>
+        <w:drawing>
+          <wp:anchor distT="0" distB="0" distL="114300" distR="114300" simplePos="0" relativeHeight="251658240" behindDoc="1" locked="0" layoutInCell="1" allowOverlap="1" wp14:anchorId="48FD5DFA" wp14:editId="7EE6B88D">
+            <wp:simplePos x="0" y="0"/>
+            <wp:positionH relativeFrom="column">
+              <wp:posOffset>4841875</wp:posOffset>
+            </wp:positionH>
+            <wp:positionV relativeFrom="page">
+              <wp:posOffset>3298825</wp:posOffset>
+            </wp:positionV>
+            <wp:extent cx="1549400" cy="1311275"/>
+            <wp:effectExtent l="0" t="0" r="0" b="3175"/>
+            <wp:wrapNone/>
+            <wp:docPr id="1093027678" name="Picture 1" descr="A close up of a colorful line&#10;&#10;AI-generated content may be incorrect."/>
+            <wp:cNvGraphicFramePr>
+              <a:graphicFrameLocks xmlns:a="http://schemas.openxmlformats.org/drawingml/2006/main" noChangeAspect="1"/>
+            </wp:cNvGraphicFramePr>
+            <a:graphic xmlns:a="http://schemas.openxmlformats.org/drawingml/2006/main">
+              <a:graphicData uri="http://schemas.openxmlformats.org/drawingml/2006/picture">
+                <pic:pic xmlns:pic="http://schemas.openxmlformats.org/drawingml/2006/picture">
+                  <pic:nvPicPr>
+                    <pic:cNvPr id="1093027678" name="Picture 1" descr="A close up of a colorful line&#10;&#10;AI-generated content may be incorrect."/>
+                    <pic:cNvPicPr/>
+                  </pic:nvPicPr>
+                  <pic:blipFill>
+                    <a:blip r:embed="rId7" cstate="print">
+                      <a:extLst>
+                        <a:ext uri="{28A0092B-C50C-407E-A947-70E740481C1C}">
+                          <a14:useLocalDpi xmlns:a14="http://schemas.microsoft.com/office/drawing/2010/main" val="0"/>
+                        </a:ext>
+                      </a:extLst>
+                    </a:blip>
+                    <a:stretch>
+                      <a:fillRect/>
+                    </a:stretch>
+                  </pic:blipFill>
+                  <pic:spPr>
+                    <a:xfrm>
+                      <a:off x="0" y="0"/>
+                      <a:ext cx="1549400" cy="1311275"/>
+                    </a:xfrm>
+                    <a:prstGeom prst="rect">
+                      <a:avLst/>
+                    </a:prstGeom>
+                  </pic:spPr>
+                </pic:pic>
+              </a:graphicData>
+            </a:graphic>
+            <wp14:sizeRelH relativeFrom="margin">
+              <wp14:pctWidth>0</wp14:pctWidth>
+            </wp14:sizeRelH>
+            <wp14:sizeRelV relativeFrom="margin">
+              <wp14:pctHeight>0</wp14:pctHeight>
+            </wp14:sizeRelV>
+          </wp:anchor>
+        </w:drawing>
+      </w:r>
+      <w:r>
         <w:t>Color Palette:</w:t>
       </w:r>
     </w:p>
     <w:p>
-      <w:r>
-        <w:t>- Background: #FFF4E9 (Soft Beige</w:t>
-      </w:r>
-      <w:r>
-        <w:t>/Peachy</w:t>
+      <w:pPr>
+        <w:pStyle w:val="ListParagraph"/>
+        <w:numPr>
+          <w:ilvl w:val="0"/>
+          <w:numId w:val="3"/>
+        </w:numPr>
+      </w:pPr>
+      <w:r>
+        <w:t xml:space="preserve">Background: </w:t>
+      </w:r>
+      <w:r>
+        <w:tab/>
+      </w:r>
+      <w:r>
+        <w:tab/>
+      </w:r>
+      <w:r>
+        <w:tab/>
+      </w:r>
+      <w:r>
+        <w:tab/>
+      </w:r>
+      <w:r>
+        <w:t>#FFF4E9 (Soft Beige)</w:t>
+      </w:r>
+    </w:p>
+    <w:p>
+      <w:pPr>
+        <w:pStyle w:val="ListParagraph"/>
+        <w:numPr>
+          <w:ilvl w:val="0"/>
+          <w:numId w:val="3"/>
+        </w:numPr>
+      </w:pPr>
+      <w:r>
+        <w:t xml:space="preserve">Main (design elements): </w:t>
+      </w:r>
+      <w:r>
+        <w:tab/>
+      </w:r>
+      <w:r>
+        <w:tab/>
+      </w:r>
+      <w:r>
+        <w:t>#D4BEE4 (Light Lavender)</w:t>
+      </w:r>
+    </w:p>
+    <w:p>
+      <w:pPr>
+        <w:pStyle w:val="ListParagraph"/>
+        <w:numPr>
+          <w:ilvl w:val="0"/>
+          <w:numId w:val="3"/>
+        </w:numPr>
+      </w:pPr>
+      <w:r>
+        <w:t xml:space="preserve">Accents (design text): </w:t>
+      </w:r>
+      <w:r>
+        <w:tab/>
+      </w:r>
+      <w:r>
+        <w:tab/>
+      </w:r>
+      <w:r>
+        <w:t>#441752 (Deep Purple)</w:t>
+      </w:r>
+    </w:p>
+    <w:p>
+      <w:pPr>
+        <w:pStyle w:val="ListParagraph"/>
+        <w:numPr>
+          <w:ilvl w:val="0"/>
+          <w:numId w:val="3"/>
+        </w:numPr>
+      </w:pPr>
+      <w:r>
+        <w:t xml:space="preserve">Buttons (clickable elements): </w:t>
+      </w:r>
+      <w:r>
+        <w:tab/>
+      </w:r>
+      <w:r>
+        <w:t>#</w:t>
+      </w:r>
+      <w:r>
+        <w:t>CA</w:t>
+      </w:r>
+      <w:r>
+        <w:t>637</w:t>
+      </w:r>
+      <w:r>
+        <w:t>D</w:t>
+      </w:r>
+      <w:r>
+        <w:t xml:space="preserve"> (Muted Pink/Cherry)</w:t>
+      </w:r>
+    </w:p>
+    <w:p>
+      <w:pPr>
+        <w:pStyle w:val="ListParagraph"/>
+        <w:numPr>
+          <w:ilvl w:val="0"/>
+          <w:numId w:val="3"/>
+        </w:numPr>
+      </w:pPr>
+      <w:r>
+        <w:t>Neutral (text box</w:t>
+      </w:r>
+      <w:r>
+        <w:t>es 1</w:t>
       </w:r>
       <w:r>
         <w:t>)</w:t>
       </w:r>
-    </w:p>
-    <w:p>
-      <w:r>
-        <w:t>- Main (design elements): #D4BEE4 (Light Lavender)</w:t>
-      </w:r>
-    </w:p>
-    <w:p>
-      <w:r>
-        <w:t>- Accents (design text): #441752 (Deep Purple)</w:t>
-      </w:r>
-    </w:p>
-    <w:p>
-      <w:r>
-        <w:t>- Buttons (clickable elements): #ca637d (Muted Pink</w:t>
-      </w:r>
-      <w:r>
-        <w:t>/Cherry</w:t>
+      <w:r>
+        <w:tab/>
+      </w:r>
+      <w:r>
+        <w:tab/>
+      </w:r>
+      <w:r>
+        <w:t>: #</w:t>
+      </w:r>
+      <w:r>
+        <w:t>F4F4F4</w:t>
+      </w:r>
+      <w:r>
+        <w:t xml:space="preserve"> (Light Grey)</w:t>
+      </w:r>
+    </w:p>
+    <w:p>
+      <w:pPr>
+        <w:pStyle w:val="ListParagraph"/>
+        <w:numPr>
+          <w:ilvl w:val="0"/>
+          <w:numId w:val="3"/>
+        </w:numPr>
+      </w:pPr>
+      <w:r>
+        <w:t>Neutral (text box</w:t>
+      </w:r>
+      <w:r>
+        <w:t>es 2</w:t>
       </w:r>
       <w:r>
         <w:t>)</w:t>
       </w:r>
-    </w:p>
-    <w:p>
-      <w:r>
-        <w:t>- Neutral (text boxes, displayed info): #cfcfcf (Light Gr</w:t>
-      </w:r>
-      <w:r>
-        <w:t>e</w:t>
-      </w:r>
-      <w:r>
-        <w:t>y)</w:t>
+      <w:r>
+        <w:tab/>
+      </w:r>
+      <w:r>
+        <w:tab/>
+      </w:r>
+      <w:r>
+        <w:t>: #</w:t>
+      </w:r>
+      <w:r>
+        <w:t>CFCFCF</w:t>
+      </w:r>
+      <w:r>
+        <w:t xml:space="preserve"> (Light Grey)</w:t>
       </w:r>
     </w:p>
     <w:p/>
@@ -78,46 +285,346 @@
       </w:r>
     </w:p>
     <w:p>
-      <w:r>
-        <w:t>- Font Family: Georgia, 'Times New Roman', Times, serif</w:t>
-      </w:r>
-    </w:p>
-    <w:p>
-      <w:r>
-        <w:t>- Font Weight: Use bold for emphasis (e.g., buttons, headers).</w:t>
-      </w:r>
-    </w:p>
-    <w:p>
-      <w:r>
-        <w:t>- Font Sizes:</w:t>
-      </w:r>
-    </w:p>
-    <w:p>
-      <w:r>
-        <w:t xml:space="preserve">  - General Text: 15px</w:t>
-      </w:r>
-      <w:r>
-        <w:t xml:space="preserve"> to 16px</w:t>
-      </w:r>
-    </w:p>
-    <w:p>
-      <w:r>
-        <w:t xml:space="preserve">  - Buttons: 16px to 22px</w:t>
-      </w:r>
-    </w:p>
-    <w:p>
-      <w:r>
-        <w:t xml:space="preserve">  - Titles/Headers: 20px to 30px</w:t>
-      </w:r>
-    </w:p>
-    <w:p>
-      <w:r>
-        <w:t>- Font Color for design elements: #441752 (Deep Purple)</w:t>
-      </w:r>
-    </w:p>
-    <w:p>
-      <w:r>
-        <w:t>- Font Color for info elements: #000000 (Black)</w:t>
+      <w:pPr>
+        <w:pStyle w:val="ListParagraph"/>
+        <w:numPr>
+          <w:ilvl w:val="0"/>
+          <w:numId w:val="3"/>
+        </w:numPr>
+      </w:pPr>
+      <w:r>
+        <w:t xml:space="preserve">Font Family: </w:t>
+      </w:r>
+      <w:r>
+        <w:rPr>
+          <w:rFonts w:ascii="Georgia" w:hAnsi="Georgia"/>
+        </w:rPr>
+        <w:t>Georgia</w:t>
+      </w:r>
+      <w:r>
+        <w:t xml:space="preserve">, </w:t>
+      </w:r>
+      <w:r>
+        <w:rPr>
+          <w:rFonts w:ascii="Times New Roman" w:hAnsi="Times New Roman" w:cs="Times New Roman"/>
+        </w:rPr>
+        <w:t>'Times New Roman'</w:t>
+      </w:r>
+      <w:r>
+        <w:t xml:space="preserve">, </w:t>
+      </w:r>
+      <w:r>
+        <w:rPr>
+          <w:rFonts w:ascii="Times" w:hAnsi="Times"/>
+        </w:rPr>
+        <w:t>Times</w:t>
+      </w:r>
+      <w:r>
+        <w:t>, serif</w:t>
+      </w:r>
+    </w:p>
+    <w:p>
+      <w:pPr>
+        <w:pStyle w:val="ListParagraph"/>
+        <w:numPr>
+          <w:ilvl w:val="0"/>
+          <w:numId w:val="3"/>
+        </w:numPr>
+      </w:pPr>
+      <w:r>
+        <w:t xml:space="preserve">Font Weight: Use </w:t>
+      </w:r>
+      <w:r>
+        <w:rPr>
+          <w:b/>
+          <w:bCs/>
+        </w:rPr>
+        <w:t>bold</w:t>
+      </w:r>
+      <w:r>
+        <w:t xml:space="preserve"> for emphasis (e.g., buttons, headers).</w:t>
+      </w:r>
+    </w:p>
+    <w:p>
+      <w:pPr>
+        <w:pStyle w:val="ListParagraph"/>
+        <w:numPr>
+          <w:ilvl w:val="0"/>
+          <w:numId w:val="3"/>
+        </w:numPr>
+      </w:pPr>
+      <w:r>
+        <w:t>Font Sizes:</w:t>
+      </w:r>
+    </w:p>
+    <w:p>
+      <w:pPr>
+        <w:pStyle w:val="ListParagraph"/>
+        <w:numPr>
+          <w:ilvl w:val="1"/>
+          <w:numId w:val="3"/>
+        </w:numPr>
+        <w:rPr>
+          <w:sz w:val="32"/>
+          <w:szCs w:val="32"/>
+        </w:rPr>
+      </w:pPr>
+      <w:r>
+        <w:rPr>
+          <w:sz w:val="32"/>
+          <w:szCs w:val="32"/>
+        </w:rPr>
+        <w:t>General Text: 15px to 16px</w:t>
+      </w:r>
+    </w:p>
+    <w:p>
+      <w:pPr>
+        <w:pStyle w:val="ListParagraph"/>
+        <w:numPr>
+          <w:ilvl w:val="1"/>
+          <w:numId w:val="3"/>
+        </w:numPr>
+        <w:rPr>
+          <w:sz w:val="32"/>
+          <w:szCs w:val="32"/>
+        </w:rPr>
+      </w:pPr>
+      <w:r>
+        <w:rPr>
+          <w:sz w:val="32"/>
+          <w:szCs w:val="32"/>
+        </w:rPr>
+        <w:t xml:space="preserve">Buttons: 16px to </w:t>
+      </w:r>
+      <w:r>
+        <w:rPr>
+          <w:sz w:val="44"/>
+          <w:szCs w:val="44"/>
+        </w:rPr>
+        <w:t>22px</w:t>
+      </w:r>
+    </w:p>
+    <w:p>
+      <w:pPr>
+        <w:pStyle w:val="ListParagraph"/>
+        <w:numPr>
+          <w:ilvl w:val="1"/>
+          <w:numId w:val="3"/>
+        </w:numPr>
+      </w:pPr>
+      <w:r>
+        <w:rPr>
+          <w:sz w:val="40"/>
+          <w:szCs w:val="40"/>
+        </w:rPr>
+        <w:t>Titles/Headers: 20px to</w:t>
+      </w:r>
+      <w:r>
+        <w:t xml:space="preserve"> </w:t>
+      </w:r>
+      <w:r>
+        <w:rPr>
+          <w:sz w:val="56"/>
+          <w:szCs w:val="56"/>
+        </w:rPr>
+        <w:t>30px</w:t>
+      </w:r>
+    </w:p>
+    <w:p>
+      <w:pPr>
+        <w:pStyle w:val="ListParagraph"/>
+        <w:numPr>
+          <w:ilvl w:val="0"/>
+          <w:numId w:val="3"/>
+        </w:numPr>
+      </w:pPr>
+      <w:r>
+        <w:rPr>
+          <w:noProof/>
+        </w:rPr>
+        <mc:AlternateContent>
+          <mc:Choice Requires="wps">
+            <w:drawing>
+              <wp:anchor distT="0" distB="0" distL="114300" distR="114300" simplePos="0" relativeHeight="251660288" behindDoc="0" locked="0" layoutInCell="1" allowOverlap="1" wp14:anchorId="3E67A98D" wp14:editId="4B98B034">
+                <wp:simplePos x="0" y="0"/>
+                <wp:positionH relativeFrom="column">
+                  <wp:posOffset>4835525</wp:posOffset>
+                </wp:positionH>
+                <wp:positionV relativeFrom="paragraph">
+                  <wp:posOffset>201930</wp:posOffset>
+                </wp:positionV>
+                <wp:extent cx="1539875" cy="200025"/>
+                <wp:effectExtent l="0" t="0" r="22225" b="28575"/>
+                <wp:wrapNone/>
+                <wp:docPr id="1405261311" name="Rectangle 2"/>
+                <wp:cNvGraphicFramePr/>
+                <a:graphic xmlns:a="http://schemas.openxmlformats.org/drawingml/2006/main">
+                  <a:graphicData uri="http://schemas.microsoft.com/office/word/2010/wordprocessingShape">
+                    <wps:wsp>
+                      <wps:cNvSpPr/>
+                      <wps:spPr>
+                        <a:xfrm>
+                          <a:off x="0" y="0"/>
+                          <a:ext cx="1539875" cy="200025"/>
+                        </a:xfrm>
+                        <a:prstGeom prst="rect">
+                          <a:avLst/>
+                        </a:prstGeom>
+                        <a:solidFill>
+                          <a:schemeClr val="tx1"/>
+                        </a:solidFill>
+                        <a:ln>
+                          <a:solidFill>
+                            <a:schemeClr val="tx1"/>
+                          </a:solidFill>
+                        </a:ln>
+                      </wps:spPr>
+                      <wps:style>
+                        <a:lnRef idx="2">
+                          <a:schemeClr val="accent1">
+                            <a:shade val="15000"/>
+                          </a:schemeClr>
+                        </a:lnRef>
+                        <a:fillRef idx="1">
+                          <a:schemeClr val="accent1"/>
+                        </a:fillRef>
+                        <a:effectRef idx="0">
+                          <a:schemeClr val="accent1"/>
+                        </a:effectRef>
+                        <a:fontRef idx="minor">
+                          <a:schemeClr val="lt1"/>
+                        </a:fontRef>
+                      </wps:style>
+                      <wps:bodyPr rot="0" spcFirstLastPara="0" vertOverflow="overflow" horzOverflow="overflow" vert="horz" wrap="square" lIns="91440" tIns="45720" rIns="91440" bIns="45720" numCol="1" spcCol="0" rtlCol="0" fromWordArt="0" anchor="ctr" anchorCtr="0" forceAA="0" compatLnSpc="1">
+                        <a:prstTxWarp prst="textNoShape">
+                          <a:avLst/>
+                        </a:prstTxWarp>
+                        <a:noAutofit/>
+                      </wps:bodyPr>
+                    </wps:wsp>
+                  </a:graphicData>
+                </a:graphic>
+              </wp:anchor>
+            </w:drawing>
+          </mc:Choice>
+          <mc:Fallback>
+            <w:pict>
+              <v:rect w14:anchorId="071BBBCC" id="Rectangle 2" o:spid="_x0000_s1026" style="position:absolute;margin-left:380.75pt;margin-top:15.9pt;width:121.25pt;height:15.75pt;z-index:251660288;visibility:visible;mso-wrap-style:square;mso-wrap-distance-left:9pt;mso-wrap-distance-top:0;mso-wrap-distance-right:9pt;mso-wrap-distance-bottom:0;mso-position-horizontal:absolute;mso-position-horizontal-relative:text;mso-position-vertical:absolute;mso-position-vertical-relative:text;v-text-anchor:middle" o:gfxdata="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" fillcolor="black [3213]" strokecolor="black [3213]" strokeweight="1.5pt"/>
+            </w:pict>
+          </mc:Fallback>
+        </mc:AlternateContent>
+      </w:r>
+      <w:r>
+        <w:rPr>
+          <w:noProof/>
+        </w:rPr>
+        <mc:AlternateContent>
+          <mc:Choice Requires="wps">
+            <w:drawing>
+              <wp:anchor distT="0" distB="0" distL="114300" distR="114300" simplePos="0" relativeHeight="251659264" behindDoc="0" locked="0" layoutInCell="1" allowOverlap="1" wp14:anchorId="2192FDA4" wp14:editId="386D1077">
+                <wp:simplePos x="0" y="0"/>
+                <wp:positionH relativeFrom="column">
+                  <wp:posOffset>4832350</wp:posOffset>
+                </wp:positionH>
+                <wp:positionV relativeFrom="paragraph">
+                  <wp:posOffset>8255</wp:posOffset>
+                </wp:positionV>
+                <wp:extent cx="1552575" cy="196850"/>
+                <wp:effectExtent l="0" t="0" r="28575" b="12700"/>
+                <wp:wrapNone/>
+                <wp:docPr id="367019836" name="Rectangle 1"/>
+                <wp:cNvGraphicFramePr/>
+                <a:graphic xmlns:a="http://schemas.openxmlformats.org/drawingml/2006/main">
+                  <a:graphicData uri="http://schemas.microsoft.com/office/word/2010/wordprocessingShape">
+                    <wps:wsp>
+                      <wps:cNvSpPr/>
+                      <wps:spPr>
+                        <a:xfrm>
+                          <a:off x="0" y="0"/>
+                          <a:ext cx="1552575" cy="196850"/>
+                        </a:xfrm>
+                        <a:prstGeom prst="rect">
+                          <a:avLst/>
+                        </a:prstGeom>
+                        <a:solidFill>
+                          <a:srgbClr val="441752"/>
+                        </a:solidFill>
+                        <a:ln>
+                          <a:solidFill>
+                            <a:schemeClr val="tx1"/>
+                          </a:solidFill>
+                        </a:ln>
+                      </wps:spPr>
+                      <wps:style>
+                        <a:lnRef idx="2">
+                          <a:schemeClr val="accent1">
+                            <a:shade val="15000"/>
+                          </a:schemeClr>
+                        </a:lnRef>
+                        <a:fillRef idx="1">
+                          <a:schemeClr val="accent1"/>
+                        </a:fillRef>
+                        <a:effectRef idx="0">
+                          <a:schemeClr val="accent1"/>
+                        </a:effectRef>
+                        <a:fontRef idx="minor">
+                          <a:schemeClr val="lt1"/>
+                        </a:fontRef>
+                      </wps:style>
+                      <wps:bodyPr rot="0" spcFirstLastPara="0" vertOverflow="overflow" horzOverflow="overflow" vert="horz" wrap="square" lIns="91440" tIns="45720" rIns="91440" bIns="45720" numCol="1" spcCol="0" rtlCol="0" fromWordArt="0" anchor="ctr" anchorCtr="0" forceAA="0" compatLnSpc="1">
+                        <a:prstTxWarp prst="textNoShape">
+                          <a:avLst/>
+                        </a:prstTxWarp>
+                        <a:noAutofit/>
+                      </wps:bodyPr>
+                    </wps:wsp>
+                  </a:graphicData>
+                </a:graphic>
+              </wp:anchor>
+            </w:drawing>
+          </mc:Choice>
+          <mc:Fallback>
+            <w:pict>
+              <v:rect w14:anchorId="6085A6EC" id="Rectangle 1" o:spid="_x0000_s1026" style="position:absolute;margin-left:380.5pt;margin-top:.65pt;width:122.25pt;height:15.5pt;z-index:251659264;visibility:visible;mso-wrap-style:square;mso-wrap-distance-left:9pt;mso-wrap-distance-top:0;mso-wrap-distance-right:9pt;mso-wrap-distance-bottom:0;mso-position-horizontal:absolute;mso-position-horizontal-relative:text;mso-position-vertical:absolute;mso-position-vertical-relative:text;v-text-anchor:middle" o:gfxdata="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" fillcolor="#441752" strokecolor="black [3213]" strokeweight="1.5pt"/>
+            </w:pict>
+          </mc:Fallback>
+        </mc:AlternateContent>
+      </w:r>
+      <w:r>
+        <w:t xml:space="preserve">Font Color for design elements: </w:t>
+      </w:r>
+      <w:r>
+        <w:tab/>
+      </w:r>
+      <w:r>
+        <w:tab/>
+      </w:r>
+      <w:r>
+        <w:t>#441752 (Deep Purple)</w:t>
+      </w:r>
+    </w:p>
+    <w:p>
+      <w:pPr>
+        <w:pStyle w:val="ListParagraph"/>
+        <w:numPr>
+          <w:ilvl w:val="0"/>
+          <w:numId w:val="3"/>
+        </w:numPr>
+      </w:pPr>
+      <w:r>
+        <w:t>Font Color for info</w:t>
+      </w:r>
+      <w:r>
+        <w:t>rmational</w:t>
+      </w:r>
+      <w:r>
+        <w:t xml:space="preserve"> elements: </w:t>
+      </w:r>
+      <w:r>
+        <w:tab/>
+      </w:r>
+      <w:r>
+        <w:t>#000000 (Black)</w:t>
       </w:r>
     </w:p>
     <w:p/>
@@ -127,15 +634,86 @@
       </w:r>
     </w:p>
     <w:p>
-      <w:r>
-        <w:t>- Use rounded corners (border-radius: 10px or 50px) for a soft, modern look.</w:t>
-      </w:r>
-    </w:p>
-    <w:p>
-      <w:r>
-        <w:t>- Avoid sharp edges for buttons, modals, and containers.</w:t>
-      </w:r>
-    </w:p>
+      <w:pPr>
+        <w:pStyle w:val="ListParagraph"/>
+        <w:numPr>
+          <w:ilvl w:val="0"/>
+          <w:numId w:val="3"/>
+        </w:numPr>
+      </w:pPr>
+      <w:r>
+        <w:t>Use rounded corners (border-radius: 10px or 50px) for a soft, modern look.</w:t>
+      </w:r>
+    </w:p>
+    <w:p>
+      <w:pPr>
+        <w:pStyle w:val="ListParagraph"/>
+        <w:numPr>
+          <w:ilvl w:val="0"/>
+          <w:numId w:val="3"/>
+        </w:numPr>
+      </w:pPr>
+      <w:r>
+        <w:t>Avoid sharp edges for buttons, modals, and containers.</w:t>
+      </w:r>
+    </w:p>
+    <w:p>
+      <w:r>
+        <w:rPr>
+          <w:noProof/>
+        </w:rPr>
+        <w:drawing>
+          <wp:anchor distT="0" distB="0" distL="114300" distR="114300" simplePos="0" relativeHeight="251661312" behindDoc="0" locked="0" layoutInCell="1" allowOverlap="1" wp14:anchorId="53D14FC2" wp14:editId="77FE6BEE">
+            <wp:simplePos x="0" y="0"/>
+            <wp:positionH relativeFrom="column">
+              <wp:posOffset>438150</wp:posOffset>
+            </wp:positionH>
+            <wp:positionV relativeFrom="page">
+              <wp:posOffset>8969375</wp:posOffset>
+            </wp:positionV>
+            <wp:extent cx="2319655" cy="860425"/>
+            <wp:effectExtent l="0" t="0" r="4445" b="0"/>
+            <wp:wrapNone/>
+            <wp:docPr id="1772992003" name="Picture 1" descr="A close-up of a login screen&#10;&#10;AI-generated content may be incorrect."/>
+            <wp:cNvGraphicFramePr>
+              <a:graphicFrameLocks xmlns:a="http://schemas.openxmlformats.org/drawingml/2006/main" noChangeAspect="1"/>
+            </wp:cNvGraphicFramePr>
+            <a:graphic xmlns:a="http://schemas.openxmlformats.org/drawingml/2006/main">
+              <a:graphicData uri="http://schemas.openxmlformats.org/drawingml/2006/picture">
+                <pic:pic xmlns:pic="http://schemas.openxmlformats.org/drawingml/2006/picture">
+                  <pic:nvPicPr>
+                    <pic:cNvPr id="1772992003" name="Picture 1" descr="A close-up of a login screen&#10;&#10;AI-generated content may be incorrect."/>
+                    <pic:cNvPicPr/>
+                  </pic:nvPicPr>
+                  <pic:blipFill>
+                    <a:blip r:embed="rId8" cstate="print">
+                      <a:extLst>
+                        <a:ext uri="{28A0092B-C50C-407E-A947-70E740481C1C}">
+                          <a14:useLocalDpi xmlns:a14="http://schemas.microsoft.com/office/drawing/2010/main" val="0"/>
+                        </a:ext>
+                      </a:extLst>
+                    </a:blip>
+                    <a:stretch>
+                      <a:fillRect/>
+                    </a:stretch>
+                  </pic:blipFill>
+                  <pic:spPr>
+                    <a:xfrm>
+                      <a:off x="0" y="0"/>
+                      <a:ext cx="2319655" cy="860425"/>
+                    </a:xfrm>
+                    <a:prstGeom prst="rect">
+                      <a:avLst/>
+                    </a:prstGeom>
+                  </pic:spPr>
+                </pic:pic>
+              </a:graphicData>
+            </a:graphic>
+          </wp:anchor>
+        </w:drawing>
+      </w:r>
+    </w:p>
+    <w:p/>
     <w:p>
       <w:r>
         <w:lastRenderedPageBreak/>
@@ -143,110 +721,348 @@
       </w:r>
     </w:p>
     <w:p>
-      <w:r>
-        <w:t xml:space="preserve">- </w:t>
-      </w:r>
+      <w:pPr>
+        <w:pStyle w:val="ListParagraph"/>
+        <w:numPr>
+          <w:ilvl w:val="0"/>
+          <w:numId w:val="3"/>
+        </w:numPr>
+      </w:pPr>
       <w:r>
         <w:t>Buttons and other elements should be generously spaced</w:t>
       </w:r>
     </w:p>
     <w:p>
-      <w:r>
-        <w:t>- Elements should not be touching or crowding eachother</w:t>
-      </w:r>
-    </w:p>
-    <w:p>
-      <w:r>
-        <w:t xml:space="preserve">   - Examples:</w:t>
-      </w:r>
-    </w:p>
-    <w:p>
-      <w:r>
-        <w:t xml:space="preserve">- </w:t>
-      </w:r>
-      <w:r>
-        <w:t>Buttons: padding: 10px 32px; margin: 10px;</w:t>
-      </w:r>
-    </w:p>
-    <w:p>
-      <w:r>
-        <w:t xml:space="preserve">- </w:t>
-      </w:r>
-      <w:r>
-        <w:t>Containers: padding: 20px; margin: 10px;</w:t>
+      <w:pPr>
+        <w:pStyle w:val="ListParagraph"/>
+        <w:numPr>
+          <w:ilvl w:val="0"/>
+          <w:numId w:val="3"/>
+        </w:numPr>
+      </w:pPr>
+      <w:r>
+        <w:t>Elements should not be touching or crowding each other</w:t>
+      </w:r>
+    </w:p>
+    <w:p>
+      <w:pPr>
+        <w:pStyle w:val="ListParagraph"/>
+        <w:numPr>
+          <w:ilvl w:val="0"/>
+          <w:numId w:val="3"/>
+        </w:numPr>
+      </w:pPr>
+      <w:r>
+        <w:t>Examples:</w:t>
+      </w:r>
+    </w:p>
+    <w:p>
+      <w:pPr>
+        <w:pStyle w:val="ListParagraph"/>
+        <w:numPr>
+          <w:ilvl w:val="1"/>
+          <w:numId w:val="3"/>
+        </w:numPr>
+      </w:pPr>
+      <w:r>
+        <w:t xml:space="preserve">Buttons: padding: 10px 32px; margin: </w:t>
+      </w:r>
+      <w:proofErr w:type="gramStart"/>
+      <w:r>
+        <w:t>10px;</w:t>
+      </w:r>
+      <w:proofErr w:type="gramEnd"/>
+    </w:p>
+    <w:p>
+      <w:pPr>
+        <w:pStyle w:val="ListParagraph"/>
+        <w:numPr>
+          <w:ilvl w:val="1"/>
+          <w:numId w:val="3"/>
+        </w:numPr>
+      </w:pPr>
+      <w:r>
+        <w:t xml:space="preserve">Containers: padding: 20px; margin: </w:t>
+      </w:r>
+      <w:proofErr w:type="gramStart"/>
+      <w:r>
+        <w:t>10px;</w:t>
+      </w:r>
+      <w:proofErr w:type="gramEnd"/>
+    </w:p>
+    <w:p>
+      <w:r>
+        <w:t>Hover Effects:</w:t>
+      </w:r>
+    </w:p>
+    <w:p>
+      <w:pPr>
+        <w:pStyle w:val="ListParagraph"/>
+        <w:numPr>
+          <w:ilvl w:val="0"/>
+          <w:numId w:val="3"/>
+        </w:numPr>
+      </w:pPr>
+      <w:r>
+        <w:t>Add subtle hover effects for buttons and interactive elements:</w:t>
+      </w:r>
+    </w:p>
+    <w:p>
+      <w:pPr>
+        <w:pStyle w:val="ListParagraph"/>
+        <w:numPr>
+          <w:ilvl w:val="1"/>
+          <w:numId w:val="3"/>
+        </w:numPr>
+      </w:pPr>
+      <w:r>
+        <w:t>Example: opacity: 0.9 on hover.</w:t>
+      </w:r>
+    </w:p>
+    <w:p>
+      <w:pPr>
+        <w:pStyle w:val="ListParagraph"/>
+        <w:ind w:left="1440"/>
+      </w:pPr>
+      <w:r>
+        <w:rPr>
+          <w:noProof/>
+        </w:rPr>
+        <w:drawing>
+          <wp:inline distT="0" distB="0" distL="0" distR="0" wp14:anchorId="7A84C10D" wp14:editId="57DEAFE6">
+            <wp:extent cx="5189670" cy="723963"/>
+            <wp:effectExtent l="0" t="0" r="0" b="0"/>
+            <wp:docPr id="970050507" name="Picture 1" descr="A purple background with pink dots&#10;&#10;AI-generated content may be incorrect."/>
+            <wp:cNvGraphicFramePr>
+              <a:graphicFrameLocks xmlns:a="http://schemas.openxmlformats.org/drawingml/2006/main" noChangeAspect="1"/>
+            </wp:cNvGraphicFramePr>
+            <a:graphic xmlns:a="http://schemas.openxmlformats.org/drawingml/2006/main">
+              <a:graphicData uri="http://schemas.openxmlformats.org/drawingml/2006/picture">
+                <pic:pic xmlns:pic="http://schemas.openxmlformats.org/drawingml/2006/picture">
+                  <pic:nvPicPr>
+                    <pic:cNvPr id="970050507" name="Picture 1" descr="A purple background with pink dots&#10;&#10;AI-generated content may be incorrect."/>
+                    <pic:cNvPicPr/>
+                  </pic:nvPicPr>
+                  <pic:blipFill>
+                    <a:blip r:embed="rId9"/>
+                    <a:stretch>
+                      <a:fillRect/>
+                    </a:stretch>
+                  </pic:blipFill>
+                  <pic:spPr>
+                    <a:xfrm>
+                      <a:off x="0" y="0"/>
+                      <a:ext cx="5189670" cy="723963"/>
+                    </a:xfrm>
+                    <a:prstGeom prst="rect">
+                      <a:avLst/>
+                    </a:prstGeom>
+                  </pic:spPr>
+                </pic:pic>
+              </a:graphicData>
+            </a:graphic>
+          </wp:inline>
+        </w:drawing>
       </w:r>
     </w:p>
     <w:p/>
     <w:p>
-      <w:r>
-        <w:t>Hover Effects:</w:t>
-      </w:r>
-    </w:p>
-    <w:p>
-      <w:r>
-        <w:t>- Add subtle hover effects for buttons and interactive elements:</w:t>
-      </w:r>
-    </w:p>
-    <w:p>
-      <w:r>
-        <w:t xml:space="preserve">  - Example: opacity: 0.9 on hover.</w:t>
-      </w:r>
-    </w:p>
-    <w:p/>
-    <w:p>
-      <w:r>
-        <w:t>---</w:t>
-      </w:r>
-    </w:p>
-    <w:p/>
-    <w:p>
-      <w:r>
+      <w:pPr>
+        <w:rPr>
+          <w:b/>
+          <w:bCs/>
+        </w:rPr>
+      </w:pPr>
+      <w:r>
+        <w:rPr>
+          <w:b/>
+          <w:bCs/>
+        </w:rPr>
         <w:t>2. Layout and Structure</w:t>
       </w:r>
     </w:p>
-    <w:p/>
+    <w:p>
+      <w:r>
+        <w:t>Responsive Design:</w:t>
+      </w:r>
+    </w:p>
+    <w:p>
+      <w:pPr>
+        <w:pStyle w:val="ListParagraph"/>
+        <w:numPr>
+          <w:ilvl w:val="0"/>
+          <w:numId w:val="3"/>
+        </w:numPr>
+        <w:jc w:val="both"/>
+      </w:pPr>
+      <w:r>
+        <w:t>Use media queries for responsiveness:</w:t>
+      </w:r>
+    </w:p>
+    <w:p>
+      <w:pPr>
+        <w:pStyle w:val="ListParagraph"/>
+        <w:numPr>
+          <w:ilvl w:val="1"/>
+          <w:numId w:val="3"/>
+        </w:numPr>
+        <w:jc w:val="both"/>
+      </w:pPr>
+      <w:r>
+        <w:t>Example: Adjust button widths and flex directions for screens smaller than 800px.</w:t>
+      </w:r>
+    </w:p>
+    <w:p>
+      <w:pPr>
+        <w:jc w:val="center"/>
+      </w:pPr>
+      <w:r>
+        <w:rPr>
+          <w:noProof/>
+        </w:rPr>
+        <w:drawing>
+          <wp:inline distT="0" distB="0" distL="0" distR="0" wp14:anchorId="7C484F26" wp14:editId="10BF94A8">
+            <wp:extent cx="5775325" cy="1005334"/>
+            <wp:effectExtent l="0" t="0" r="0" b="4445"/>
+            <wp:docPr id="807312703" name="Picture 1" descr="A purple sign up with black text&#10;&#10;AI-generated content may be incorrect."/>
+            <wp:cNvGraphicFramePr>
+              <a:graphicFrameLocks xmlns:a="http://schemas.openxmlformats.org/drawingml/2006/main" noChangeAspect="1"/>
+            </wp:cNvGraphicFramePr>
+            <a:graphic xmlns:a="http://schemas.openxmlformats.org/drawingml/2006/main">
+              <a:graphicData uri="http://schemas.openxmlformats.org/drawingml/2006/picture">
+                <pic:pic xmlns:pic="http://schemas.openxmlformats.org/drawingml/2006/picture">
+                  <pic:nvPicPr>
+                    <pic:cNvPr id="807312703" name="Picture 1" descr="A purple sign up with black text&#10;&#10;AI-generated content may be incorrect."/>
+                    <pic:cNvPicPr/>
+                  </pic:nvPicPr>
+                  <pic:blipFill>
+                    <a:blip r:embed="rId10"/>
+                    <a:stretch>
+                      <a:fillRect/>
+                    </a:stretch>
+                  </pic:blipFill>
+                  <pic:spPr>
+                    <a:xfrm>
+                      <a:off x="0" y="0"/>
+                      <a:ext cx="5804552" cy="1010422"/>
+                    </a:xfrm>
+                    <a:prstGeom prst="rect">
+                      <a:avLst/>
+                    </a:prstGeom>
+                  </pic:spPr>
+                </pic:pic>
+              </a:graphicData>
+            </a:graphic>
+          </wp:inline>
+        </w:drawing>
+      </w:r>
+    </w:p>
+    <w:p>
+      <w:pPr>
+        <w:jc w:val="center"/>
+      </w:pPr>
+      <w:r>
+        <w:rPr>
+          <w:noProof/>
+        </w:rPr>
+        <w:drawing>
+          <wp:inline distT="0" distB="0" distL="0" distR="0" wp14:anchorId="6C7FD098" wp14:editId="69E40617">
+            <wp:extent cx="3316584" cy="1508125"/>
+            <wp:effectExtent l="0" t="0" r="0" b="0"/>
+            <wp:docPr id="1798094688" name="Picture 1" descr="A screenshot of a login page&#10;&#10;AI-generated content may be incorrect."/>
+            <wp:cNvGraphicFramePr>
+              <a:graphicFrameLocks xmlns:a="http://schemas.openxmlformats.org/drawingml/2006/main" noChangeAspect="1"/>
+            </wp:cNvGraphicFramePr>
+            <a:graphic xmlns:a="http://schemas.openxmlformats.org/drawingml/2006/main">
+              <a:graphicData uri="http://schemas.openxmlformats.org/drawingml/2006/picture">
+                <pic:pic xmlns:pic="http://schemas.openxmlformats.org/drawingml/2006/picture">
+                  <pic:nvPicPr>
+                    <pic:cNvPr id="1798094688" name="Picture 1" descr="A screenshot of a login page&#10;&#10;AI-generated content may be incorrect."/>
+                    <pic:cNvPicPr/>
+                  </pic:nvPicPr>
+                  <pic:blipFill>
+                    <a:blip r:embed="rId11"/>
+                    <a:stretch>
+                      <a:fillRect/>
+                    </a:stretch>
+                  </pic:blipFill>
+                  <pic:spPr>
+                    <a:xfrm>
+                      <a:off x="0" y="0"/>
+                      <a:ext cx="3329205" cy="1513864"/>
+                    </a:xfrm>
+                    <a:prstGeom prst="rect">
+                      <a:avLst/>
+                    </a:prstGeom>
+                  </pic:spPr>
+                </pic:pic>
+              </a:graphicData>
+            </a:graphic>
+          </wp:inline>
+        </w:drawing>
+      </w:r>
+    </w:p>
     <w:p>
       <w:r>
         <w:t>Alignment:</w:t>
       </w:r>
     </w:p>
     <w:p>
-      <w:r>
-        <w:t>- Most elements should be centered for a mobile-first design.</w:t>
-      </w:r>
-    </w:p>
-    <w:p>
-      <w:r>
-        <w:t xml:space="preserve">- Search fields and links are always at or near the top of the page </w:t>
-      </w:r>
-    </w:p>
-    <w:p>
-      <w:r>
-        <w:t>- Buttons should be centered when not part of a larger element</w:t>
-      </w:r>
-    </w:p>
-    <w:p>
-      <w:r>
-        <w:t>- Buttons that are part of elements should be right-justified towards the bottom-right corner of the element</w:t>
-      </w:r>
-    </w:p>
-    <w:p/>
-    <w:p>
-      <w:r>
-        <w:t>Responsive Design:</w:t>
-      </w:r>
-    </w:p>
-    <w:p>
-      <w:r>
-        <w:t>- Use media queries for responsiveness:</w:t>
-      </w:r>
-    </w:p>
-    <w:p>
-      <w:r>
-        <w:t xml:space="preserve">  - Example: Adjust button widths and flex directions for screens smaller than 800px.</w:t>
-      </w:r>
-    </w:p>
-    <w:p/>
+      <w:pPr>
+        <w:pStyle w:val="ListParagraph"/>
+        <w:numPr>
+          <w:ilvl w:val="0"/>
+          <w:numId w:val="3"/>
+        </w:numPr>
+      </w:pPr>
+      <w:r>
+        <w:t>Most elements should be centered for a mobile-first design.</w:t>
+      </w:r>
+    </w:p>
+    <w:p>
+      <w:pPr>
+        <w:pStyle w:val="ListParagraph"/>
+        <w:numPr>
+          <w:ilvl w:val="0"/>
+          <w:numId w:val="3"/>
+        </w:numPr>
+      </w:pPr>
+      <w:r>
+        <w:t xml:space="preserve">Search fields and links are always at or near the top of the page </w:t>
+      </w:r>
+    </w:p>
+    <w:p>
+      <w:pPr>
+        <w:pStyle w:val="ListParagraph"/>
+        <w:numPr>
+          <w:ilvl w:val="0"/>
+          <w:numId w:val="3"/>
+        </w:numPr>
+      </w:pPr>
+      <w:r>
+        <w:t>Buttons should be centered when not part of a larger element</w:t>
+      </w:r>
+    </w:p>
+    <w:p>
+      <w:pPr>
+        <w:pStyle w:val="ListParagraph"/>
+        <w:numPr>
+          <w:ilvl w:val="0"/>
+          <w:numId w:val="3"/>
+        </w:numPr>
+      </w:pPr>
+      <w:r>
+        <w:t xml:space="preserve">Buttons that are part of elements should be </w:t>
+      </w:r>
+      <w:proofErr w:type="gramStart"/>
+      <w:r>
+        <w:t>right-justified</w:t>
+      </w:r>
+      <w:proofErr w:type="gramEnd"/>
+      <w:r>
+        <w:t>.</w:t>
+      </w:r>
+    </w:p>
     <w:p>
       <w:r>
         <w:lastRenderedPageBreak/>
@@ -254,37 +1070,1512 @@
       </w:r>
     </w:p>
     <w:p>
-      <w:r>
-        <w:t>- "booked" link always visible in top-left.</w:t>
-      </w:r>
-    </w:p>
-    <w:p>
-      <w:pPr>
-        <w:ind w:left="720"/>
-      </w:pPr>
-      <w:r>
-        <w:t xml:space="preserve">  - font-family: Georgia, 'Times New Roman', Times, serif;</w:t>
-      </w:r>
-    </w:p>
-    <w:p>
-      <w:pPr>
-        <w:ind w:left="720"/>
-      </w:pPr>
-      <w:r>
-        <w:t xml:space="preserve">  - font-weight: bold;</w:t>
-      </w:r>
-    </w:p>
-    <w:p>
-      <w:pPr>
-        <w:ind w:left="720"/>
-      </w:pPr>
-      <w:r>
-        <w:t xml:space="preserve">  - font-size: 30px;</w:t>
-      </w:r>
-    </w:p>
+      <w:pPr>
+        <w:pStyle w:val="ListParagraph"/>
+        <w:numPr>
+          <w:ilvl w:val="0"/>
+          <w:numId w:val="3"/>
+        </w:numPr>
+      </w:pPr>
+      <w:r>
+        <w:t>"booked" logo always visible in top-left.</w:t>
+      </w:r>
+    </w:p>
+    <w:p>
+      <w:pPr>
+        <w:pStyle w:val="ListParagraph"/>
+        <w:numPr>
+          <w:ilvl w:val="0"/>
+          <w:numId w:val="3"/>
+        </w:numPr>
+      </w:pPr>
+      <w:r>
+        <w:t>“Sign Out” button only appears when a user is signed in in the top-right corner.</w:t>
+      </w:r>
+    </w:p>
+    <w:p>
+      <w:pPr>
+        <w:pStyle w:val="ListParagraph"/>
+        <w:numPr>
+          <w:ilvl w:val="0"/>
+          <w:numId w:val="3"/>
+        </w:numPr>
+      </w:pPr>
+      <w:r>
+        <w:t>Header present on every page except Landing page.</w:t>
+      </w:r>
+    </w:p>
+    <w:p/>
+    <w:p>
+      <w:r>
+        <w:t>Results (bookshelf books and search results)</w:t>
+      </w:r>
+    </w:p>
+    <w:p>
+      <w:pPr>
+        <w:pStyle w:val="ListParagraph"/>
+        <w:numPr>
+          <w:ilvl w:val="0"/>
+          <w:numId w:val="3"/>
+        </w:numPr>
+      </w:pPr>
+      <w:r>
+        <w:t>“Stack” of elements going down the page, not side-by-side.</w:t>
+      </w:r>
+    </w:p>
+    <w:p>
+      <w:pPr>
+        <w:pStyle w:val="ListParagraph"/>
+        <w:numPr>
+          <w:ilvl w:val="0"/>
+          <w:numId w:val="3"/>
+        </w:numPr>
+      </w:pPr>
+      <w:r>
+        <w:t xml:space="preserve">Elements are wider than tall and become </w:t>
+      </w:r>
+      <w:proofErr w:type="gramStart"/>
+      <w:r>
+        <w:t>100% page</w:t>
+      </w:r>
+      <w:proofErr w:type="gramEnd"/>
+      <w:r>
+        <w:t xml:space="preserve"> width when view-window narrows to mobile width.</w:t>
+      </w:r>
+    </w:p>
+    <w:p>
+      <w:pPr>
+        <w:pStyle w:val="ListParagraph"/>
+        <w:numPr>
+          <w:ilvl w:val="0"/>
+          <w:numId w:val="3"/>
+        </w:numPr>
+      </w:pPr>
+      <w:r>
+        <w:t xml:space="preserve">Buttons are right-justified and don’t shrink when window narrows (to maintain </w:t>
+      </w:r>
+      <w:proofErr w:type="spellStart"/>
+      <w:r>
+        <w:t>clickability</w:t>
+      </w:r>
+      <w:proofErr w:type="spellEnd"/>
+      <w:r>
+        <w:t>)</w:t>
+      </w:r>
+    </w:p>
+    <w:p>
+      <w:pPr>
+        <w:rPr>
+          <w:b/>
+          <w:bCs/>
+        </w:rPr>
+      </w:pPr>
+    </w:p>
+    <w:p>
+      <w:pPr>
+        <w:rPr>
+          <w:b/>
+          <w:bCs/>
+        </w:rPr>
+      </w:pPr>
+      <w:r>
+        <w:rPr>
+          <w:b/>
+          <w:bCs/>
+        </w:rPr>
+        <w:t>3. Page Description</w:t>
+      </w:r>
+      <w:r>
+        <w:rPr>
+          <w:b/>
+          <w:bCs/>
+        </w:rPr>
+        <w:t>s and Screenshots</w:t>
+      </w:r>
+    </w:p>
+    <w:p>
+      <w:r>
+        <w:rPr>
+          <w:b/>
+          <w:bCs/>
+        </w:rPr>
+        <w:t>Index</w:t>
+      </w:r>
+      <w:r>
+        <w:t>:</w:t>
+      </w:r>
+    </w:p>
+    <w:p>
+      <w:pPr>
+        <w:pStyle w:val="ListParagraph"/>
+        <w:numPr>
+          <w:ilvl w:val="0"/>
+          <w:numId w:val="3"/>
+        </w:numPr>
+      </w:pPr>
+      <w:r>
+        <w:t>Very simple design</w:t>
+      </w:r>
+    </w:p>
+    <w:p>
+      <w:pPr>
+        <w:pStyle w:val="ListParagraph"/>
+        <w:numPr>
+          <w:ilvl w:val="0"/>
+          <w:numId w:val="3"/>
+        </w:numPr>
+      </w:pPr>
+      <w:r>
+        <w:t>A prominent welcome banner (#welcomeBanner) displays the text "welcome to booked!" at the center of the page. The banner is styled to grab attention and set the tone for the application.</w:t>
+      </w:r>
+    </w:p>
+    <w:p>
+      <w:pPr>
+        <w:pStyle w:val="ListParagraph"/>
+        <w:numPr>
+          <w:ilvl w:val="0"/>
+          <w:numId w:val="3"/>
+        </w:numPr>
+      </w:pPr>
+      <w:r>
+        <w:t>A central container (#buttonContainer) houses three primary navigation links:</w:t>
+      </w:r>
+    </w:p>
+    <w:p>
+      <w:pPr>
+        <w:pStyle w:val="ListParagraph"/>
+        <w:numPr>
+          <w:ilvl w:val="1"/>
+          <w:numId w:val="3"/>
+        </w:numPr>
+      </w:pPr>
+      <w:r>
+        <w:t>Login: Redirects users to the login page.</w:t>
+      </w:r>
+    </w:p>
+    <w:p>
+      <w:pPr>
+        <w:pStyle w:val="ListParagraph"/>
+        <w:numPr>
+          <w:ilvl w:val="1"/>
+          <w:numId w:val="3"/>
+        </w:numPr>
+      </w:pPr>
+      <w:r>
+        <w:t>Sign Up: Redirects users to the registration page.</w:t>
+      </w:r>
+    </w:p>
+    <w:p>
+      <w:pPr>
+        <w:pStyle w:val="ListParagraph"/>
+        <w:numPr>
+          <w:ilvl w:val="1"/>
+          <w:numId w:val="3"/>
+        </w:numPr>
+      </w:pPr>
+      <w:r>
+        <w:t>About Us: Redirects users to the "About Us" page.</w:t>
+      </w:r>
+    </w:p>
+    <w:p>
+      <w:pPr>
+        <w:pStyle w:val="ListParagraph"/>
+        <w:numPr>
+          <w:ilvl w:val="0"/>
+          <w:numId w:val="3"/>
+        </w:numPr>
+      </w:pPr>
+      <w:r>
+        <w:t>Buttons are styled to look clickable and visually distinct.</w:t>
+      </w:r>
+    </w:p>
+    <w:p>
+      <w:pPr>
+        <w:pStyle w:val="ListParagraph"/>
+        <w:numPr>
+          <w:ilvl w:val="0"/>
+          <w:numId w:val="3"/>
+        </w:numPr>
+      </w:pPr>
+      <w:r>
+        <w:t xml:space="preserve">Hidden error container under main buttons that only appears when major database issues are </w:t>
+      </w:r>
+      <w:r>
+        <w:t>occurring</w:t>
+      </w:r>
+      <w:r>
+        <w:t xml:space="preserve"> (the database is down, no connectivity, </w:t>
+      </w:r>
+      <w:proofErr w:type="spellStart"/>
+      <w:r>
+        <w:t>etc</w:t>
+      </w:r>
+      <w:proofErr w:type="spellEnd"/>
+      <w:r>
+        <w:t>)</w:t>
+      </w:r>
+    </w:p>
+    <w:p>
+      <w:pPr>
+        <w:pStyle w:val="ListParagraph"/>
+      </w:pPr>
+      <w:r>
+        <w:rPr>
+          <w:noProof/>
+        </w:rPr>
+        <w:drawing>
+          <wp:inline distT="0" distB="0" distL="0" distR="0" wp14:anchorId="52280914" wp14:editId="64F1170F">
+            <wp:extent cx="3979718" cy="1601837"/>
+            <wp:effectExtent l="0" t="0" r="1905" b="0"/>
+            <wp:docPr id="253244145" name="Picture 1" descr="A screenshot of a computer screen&#10;&#10;AI-generated content may be incorrect."/>
+            <wp:cNvGraphicFramePr>
+              <a:graphicFrameLocks xmlns:a="http://schemas.openxmlformats.org/drawingml/2006/main" noChangeAspect="1"/>
+            </wp:cNvGraphicFramePr>
+            <a:graphic xmlns:a="http://schemas.openxmlformats.org/drawingml/2006/main">
+              <a:graphicData uri="http://schemas.openxmlformats.org/drawingml/2006/picture">
+                <pic:pic xmlns:pic="http://schemas.openxmlformats.org/drawingml/2006/picture">
+                  <pic:nvPicPr>
+                    <pic:cNvPr id="1356771215" name="Picture 1" descr="A screenshot of a computer screen&#10;&#10;AI-generated content may be incorrect."/>
+                    <pic:cNvPicPr/>
+                  </pic:nvPicPr>
+                  <pic:blipFill>
+                    <a:blip r:embed="rId12"/>
+                    <a:stretch>
+                      <a:fillRect/>
+                    </a:stretch>
+                  </pic:blipFill>
+                  <pic:spPr>
+                    <a:xfrm>
+                      <a:off x="0" y="0"/>
+                      <a:ext cx="4003443" cy="1611386"/>
+                    </a:xfrm>
+                    <a:prstGeom prst="rect">
+                      <a:avLst/>
+                    </a:prstGeom>
+                  </pic:spPr>
+                </pic:pic>
+              </a:graphicData>
+            </a:graphic>
+          </wp:inline>
+        </w:drawing>
+      </w:r>
+    </w:p>
+    <w:p>
+      <w:r>
+        <w:br w:type="page"/>
+      </w:r>
+    </w:p>
+    <w:p>
+      <w:pPr>
+        <w:rPr>
+          <w:b/>
+          <w:bCs/>
+        </w:rPr>
+      </w:pPr>
+      <w:r>
+        <w:rPr>
+          <w:b/>
+          <w:bCs/>
+        </w:rPr>
+        <w:lastRenderedPageBreak/>
+        <w:t>About Us:</w:t>
+      </w:r>
+    </w:p>
+    <w:p>
+      <w:pPr>
+        <w:pStyle w:val="ListParagraph"/>
+        <w:numPr>
+          <w:ilvl w:val="0"/>
+          <w:numId w:val="3"/>
+        </w:numPr>
+      </w:pPr>
+      <w:r>
+        <w:t>Each card contains:</w:t>
+      </w:r>
+    </w:p>
+    <w:p>
+      <w:pPr>
+        <w:pStyle w:val="ListParagraph"/>
+        <w:numPr>
+          <w:ilvl w:val="1"/>
+          <w:numId w:val="3"/>
+        </w:numPr>
+      </w:pPr>
+      <w:r>
+        <w:t xml:space="preserve">A headshot or caricature of the team member </w:t>
+      </w:r>
+      <w:proofErr w:type="gramStart"/>
+      <w:r>
+        <w:t>(.</w:t>
+      </w:r>
+      <w:proofErr w:type="spellStart"/>
+      <w:r>
+        <w:t>aboutUsImage</w:t>
+      </w:r>
+      <w:proofErr w:type="spellEnd"/>
+      <w:proofErr w:type="gramEnd"/>
+      <w:r>
+        <w:t>).</w:t>
+      </w:r>
+    </w:p>
+    <w:p>
+      <w:pPr>
+        <w:pStyle w:val="ListParagraph"/>
+        <w:numPr>
+          <w:ilvl w:val="1"/>
+          <w:numId w:val="3"/>
+        </w:numPr>
+      </w:pPr>
+      <w:r>
+        <w:t xml:space="preserve">Name: Displayed prominently as a title </w:t>
+      </w:r>
+      <w:proofErr w:type="gramStart"/>
+      <w:r>
+        <w:t>(.</w:t>
+      </w:r>
+      <w:proofErr w:type="spellStart"/>
+      <w:r>
+        <w:t>aboutUsTitle</w:t>
+      </w:r>
+      <w:proofErr w:type="spellEnd"/>
+      <w:proofErr w:type="gramEnd"/>
+      <w:r>
+        <w:t>).</w:t>
+      </w:r>
+    </w:p>
+    <w:p>
+      <w:pPr>
+        <w:pStyle w:val="ListParagraph"/>
+        <w:numPr>
+          <w:ilvl w:val="1"/>
+          <w:numId w:val="3"/>
+        </w:numPr>
+      </w:pPr>
+      <w:r>
+        <w:t xml:space="preserve">Role: A short description of the team member's role </w:t>
+      </w:r>
+      <w:proofErr w:type="gramStart"/>
+      <w:r>
+        <w:t>(.</w:t>
+      </w:r>
+      <w:proofErr w:type="spellStart"/>
+      <w:r>
+        <w:t>aboutUsDescription</w:t>
+      </w:r>
+      <w:proofErr w:type="spellEnd"/>
+      <w:proofErr w:type="gramEnd"/>
+      <w:r>
+        <w:t>).</w:t>
+      </w:r>
+    </w:p>
+    <w:p>
+      <w:pPr>
+        <w:pStyle w:val="ListParagraph"/>
+        <w:numPr>
+          <w:ilvl w:val="1"/>
+          <w:numId w:val="3"/>
+        </w:numPr>
+      </w:pPr>
+      <w:r>
+        <w:t xml:space="preserve">Additional Description: A brief, lighthearted or personal note about the team member. </w:t>
+      </w:r>
+    </w:p>
+    <w:p>
+      <w:pPr>
+        <w:pStyle w:val="ListParagraph"/>
+        <w:numPr>
+          <w:ilvl w:val="0"/>
+          <w:numId w:val="3"/>
+        </w:numPr>
+      </w:pPr>
+      <w:r>
+        <w:t>The team members are displayed in a grid-like layout using a flexbox container</w:t>
+      </w:r>
+    </w:p>
+    <w:p>
+      <w:pPr>
+        <w:pStyle w:val="ListParagraph"/>
+        <w:numPr>
+          <w:ilvl w:val="0"/>
+          <w:numId w:val="3"/>
+        </w:numPr>
+      </w:pPr>
+      <w:r>
+        <w:t xml:space="preserve">Each team member is represented as an individual card </w:t>
+      </w:r>
+    </w:p>
+    <w:p>
+      <w:pPr>
+        <w:pStyle w:val="ListParagraph"/>
+        <w:numPr>
+          <w:ilvl w:val="0"/>
+          <w:numId w:val="3"/>
+        </w:numPr>
+      </w:pPr>
+      <w:r>
+        <w:t xml:space="preserve">All elements are </w:t>
+      </w:r>
+      <w:proofErr w:type="gramStart"/>
+      <w:r>
+        <w:t>center-aligned</w:t>
+      </w:r>
+      <w:proofErr w:type="gramEnd"/>
+      <w:r>
+        <w:t xml:space="preserve"> within their respective cards for a clean and balanced look.</w:t>
+      </w:r>
+    </w:p>
+    <w:p>
+      <w:pPr>
+        <w:pStyle w:val="ListParagraph"/>
+        <w:numPr>
+          <w:ilvl w:val="0"/>
+          <w:numId w:val="3"/>
+        </w:numPr>
+      </w:pPr>
+      <w:r>
+        <w:t>The layout is designed to be responsive, ensuring proper alignment and spacing on smaller screens. Cards stack vertically on narrow viewports for better usability.</w:t>
+      </w:r>
+    </w:p>
+    <w:p>
+      <w:pPr>
+        <w:pStyle w:val="ListParagraph"/>
+      </w:pPr>
+    </w:p>
+    <w:p>
+      <w:pPr>
+        <w:jc w:val="center"/>
+      </w:pPr>
+      <w:r>
+        <w:rPr>
+          <w:noProof/>
+        </w:rPr>
+        <w:drawing>
+          <wp:inline distT="0" distB="0" distL="0" distR="0" wp14:anchorId="244B0E5A" wp14:editId="6E724A11">
+            <wp:extent cx="3710956" cy="2417619"/>
+            <wp:effectExtent l="0" t="0" r="3810" b="1905"/>
+            <wp:docPr id="941644089" name="Picture 1" descr="A group of people with text&#10;&#10;AI-generated content may be incorrect."/>
+            <wp:cNvGraphicFramePr>
+              <a:graphicFrameLocks xmlns:a="http://schemas.openxmlformats.org/drawingml/2006/main" noChangeAspect="1"/>
+            </wp:cNvGraphicFramePr>
+            <a:graphic xmlns:a="http://schemas.openxmlformats.org/drawingml/2006/main">
+              <a:graphicData uri="http://schemas.openxmlformats.org/drawingml/2006/picture">
+                <pic:pic xmlns:pic="http://schemas.openxmlformats.org/drawingml/2006/picture">
+                  <pic:nvPicPr>
+                    <pic:cNvPr id="2064622531" name="Picture 1" descr="A group of people with text&#10;&#10;AI-generated content may be incorrect."/>
+                    <pic:cNvPicPr/>
+                  </pic:nvPicPr>
+                  <pic:blipFill>
+                    <a:blip r:embed="rId13"/>
+                    <a:stretch>
+                      <a:fillRect/>
+                    </a:stretch>
+                  </pic:blipFill>
+                  <pic:spPr>
+                    <a:xfrm>
+                      <a:off x="0" y="0"/>
+                      <a:ext cx="3736940" cy="2434547"/>
+                    </a:xfrm>
+                    <a:prstGeom prst="rect">
+                      <a:avLst/>
+                    </a:prstGeom>
+                  </pic:spPr>
+                </pic:pic>
+              </a:graphicData>
+            </a:graphic>
+          </wp:inline>
+        </w:drawing>
+      </w:r>
+    </w:p>
+    <w:p>
+      <w:pPr>
+        <w:jc w:val="center"/>
+      </w:pPr>
+    </w:p>
+    <w:p>
+      <w:r>
+        <w:br w:type="page"/>
+      </w:r>
+    </w:p>
+    <w:p>
+      <w:pPr>
+        <w:rPr>
+          <w:b/>
+          <w:bCs/>
+        </w:rPr>
+      </w:pPr>
+      <w:r>
+        <w:rPr>
+          <w:b/>
+          <w:bCs/>
+        </w:rPr>
+        <w:lastRenderedPageBreak/>
+        <w:t>Login and Register</w:t>
+      </w:r>
+    </w:p>
+    <w:p>
+      <w:pPr>
+        <w:pStyle w:val="ListParagraph"/>
+        <w:numPr>
+          <w:ilvl w:val="0"/>
+          <w:numId w:val="3"/>
+        </w:numPr>
+      </w:pPr>
+      <w:r>
+        <w:t>These pages have very similar designs</w:t>
+      </w:r>
+    </w:p>
+    <w:p>
+      <w:pPr>
+        <w:pStyle w:val="ListParagraph"/>
+        <w:numPr>
+          <w:ilvl w:val="0"/>
+          <w:numId w:val="3"/>
+        </w:numPr>
+      </w:pPr>
+      <w:r>
+        <w:t>Centered container with multiple text fields</w:t>
+      </w:r>
+    </w:p>
+    <w:p>
+      <w:pPr>
+        <w:pStyle w:val="ListParagraph"/>
+        <w:numPr>
+          <w:ilvl w:val="0"/>
+          <w:numId w:val="3"/>
+        </w:numPr>
+      </w:pPr>
+      <w:r>
+        <w:t>Text fields have rounded corners to match overall design</w:t>
+      </w:r>
+    </w:p>
+    <w:p>
+      <w:pPr>
+        <w:pStyle w:val="ListParagraph"/>
+        <w:numPr>
+          <w:ilvl w:val="1"/>
+          <w:numId w:val="3"/>
+        </w:numPr>
+      </w:pPr>
+      <w:r>
+        <w:t>Two text fields for Login (username and password)</w:t>
+      </w:r>
+    </w:p>
+    <w:p>
+      <w:pPr>
+        <w:pStyle w:val="ListParagraph"/>
+        <w:numPr>
+          <w:ilvl w:val="1"/>
+          <w:numId w:val="3"/>
+        </w:numPr>
+      </w:pPr>
+      <w:r>
+        <w:t>Fields configured to be hidden when "Login" button is pushed</w:t>
+      </w:r>
+    </w:p>
+    <w:p>
+      <w:pPr>
+        <w:pStyle w:val="ListParagraph"/>
+        <w:numPr>
+          <w:ilvl w:val="1"/>
+          <w:numId w:val="3"/>
+        </w:numPr>
+      </w:pPr>
+      <w:r>
+        <w:t>Three text fields for Register (username, password, password confirmation)</w:t>
+      </w:r>
+    </w:p>
+    <w:p>
+      <w:pPr>
+        <w:pStyle w:val="ListParagraph"/>
+        <w:numPr>
+          <w:ilvl w:val="0"/>
+          <w:numId w:val="3"/>
+        </w:numPr>
+      </w:pPr>
+      <w:r>
+        <w:t>"Submit" button with page-specific labelling follows normal design</w:t>
+      </w:r>
+    </w:p>
+    <w:p>
+      <w:pPr>
+        <w:pStyle w:val="ListParagraph"/>
+        <w:numPr>
+          <w:ilvl w:val="0"/>
+          <w:numId w:val="3"/>
+        </w:numPr>
+      </w:pPr>
+      <w:r>
+        <w:t>Text fields have hidden error messages that appear when input violates constraints</w:t>
+      </w:r>
+    </w:p>
+    <w:p>
+      <w:pPr>
+        <w:pStyle w:val="ListParagraph"/>
+        <w:numPr>
+          <w:ilvl w:val="1"/>
+          <w:numId w:val="3"/>
+        </w:numPr>
+      </w:pPr>
+      <w:r>
+        <w:t>Error messages are plain back text with no decoration.</w:t>
+      </w:r>
+    </w:p>
+    <w:p>
+      <w:pPr>
+        <w:pStyle w:val="ListParagraph"/>
+        <w:numPr>
+          <w:ilvl w:val="1"/>
+          <w:numId w:val="3"/>
+        </w:numPr>
+      </w:pPr>
+      <w:r>
+        <w:t>Small hidden error container that displays above the main container</w:t>
+      </w:r>
+    </w:p>
+    <w:p>
+      <w:pPr>
+        <w:pStyle w:val="ListParagraph"/>
+        <w:numPr>
+          <w:ilvl w:val="1"/>
+          <w:numId w:val="3"/>
+        </w:numPr>
+      </w:pPr>
+      <w:r>
+        <w:t xml:space="preserve">Advises user of login issues (invalid password, invalid username, </w:t>
+      </w:r>
+      <w:proofErr w:type="spellStart"/>
+      <w:r>
+        <w:t>etc</w:t>
+      </w:r>
+      <w:proofErr w:type="spellEnd"/>
+      <w:r>
+        <w:t>)</w:t>
+      </w:r>
+    </w:p>
+    <w:p>
+      <w:pPr>
+        <w:pStyle w:val="ListParagraph"/>
+        <w:numPr>
+          <w:ilvl w:val="1"/>
+          <w:numId w:val="3"/>
+        </w:numPr>
+      </w:pPr>
+      <w:r>
+        <w:t>Plain text like other error conditions</w:t>
+      </w:r>
+    </w:p>
+    <w:p>
+      <w:pPr>
+        <w:pStyle w:val="ListParagraph"/>
+      </w:pPr>
+    </w:p>
+    <w:tbl>
+      <w:tblPr>
+        <w:tblStyle w:val="TableGrid"/>
+        <w:tblW w:w="0" w:type="auto"/>
+        <w:tblLook w:val="04A0" w:firstRow="1" w:lastRow="0" w:firstColumn="1" w:lastColumn="0" w:noHBand="0" w:noVBand="1"/>
+      </w:tblPr>
+      <w:tblGrid>
+        <w:gridCol w:w="5395"/>
+        <w:gridCol w:w="5395"/>
+      </w:tblGrid>
+      <w:tr>
+        <w:tc>
+          <w:tcPr>
+            <w:tcW w:w="5395" w:type="dxa"/>
+          </w:tcPr>
+          <w:p>
+            <w:pPr>
+              <w:jc w:val="center"/>
+            </w:pPr>
+            <w:r>
+              <w:rPr>
+                <w:noProof/>
+              </w:rPr>
+              <w:drawing>
+                <wp:inline distT="0" distB="0" distL="0" distR="0" wp14:anchorId="46B701D2" wp14:editId="7899EDCB">
+                  <wp:extent cx="2866832" cy="2751628"/>
+                  <wp:effectExtent l="0" t="0" r="0" b="0"/>
+                  <wp:docPr id="156654948" name="Picture 1" descr="A purple and white login page&#10;&#10;AI-generated content may be incorrect."/>
+                  <wp:cNvGraphicFramePr>
+                    <a:graphicFrameLocks xmlns:a="http://schemas.openxmlformats.org/drawingml/2006/main" noChangeAspect="1"/>
+                  </wp:cNvGraphicFramePr>
+                  <a:graphic xmlns:a="http://schemas.openxmlformats.org/drawingml/2006/main">
+                    <a:graphicData uri="http://schemas.openxmlformats.org/drawingml/2006/picture">
+                      <pic:pic xmlns:pic="http://schemas.openxmlformats.org/drawingml/2006/picture">
+                        <pic:nvPicPr>
+                          <pic:cNvPr id="156654948" name="Picture 1" descr="A purple and white login page&#10;&#10;AI-generated content may be incorrect."/>
+                          <pic:cNvPicPr/>
+                        </pic:nvPicPr>
+                        <pic:blipFill>
+                          <a:blip r:embed="rId14"/>
+                          <a:stretch>
+                            <a:fillRect/>
+                          </a:stretch>
+                        </pic:blipFill>
+                        <pic:spPr>
+                          <a:xfrm>
+                            <a:off x="0" y="0"/>
+                            <a:ext cx="2875212" cy="2759672"/>
+                          </a:xfrm>
+                          <a:prstGeom prst="rect">
+                            <a:avLst/>
+                          </a:prstGeom>
+                        </pic:spPr>
+                      </pic:pic>
+                    </a:graphicData>
+                  </a:graphic>
+                </wp:inline>
+              </w:drawing>
+            </w:r>
+          </w:p>
+        </w:tc>
+        <w:tc>
+          <w:tcPr>
+            <w:tcW w:w="5395" w:type="dxa"/>
+          </w:tcPr>
+          <w:p>
+            <w:pPr>
+              <w:jc w:val="center"/>
+            </w:pPr>
+            <w:r>
+              <w:rPr>
+                <w:noProof/>
+              </w:rPr>
+              <w:drawing>
+                <wp:inline distT="0" distB="0" distL="0" distR="0" wp14:anchorId="7034461B" wp14:editId="0AC31219">
+                  <wp:extent cx="2476848" cy="2864428"/>
+                  <wp:effectExtent l="0" t="0" r="0" b="0"/>
+                  <wp:docPr id="291863030" name="Picture 1" descr="A screenshot of a login form&#10;&#10;AI-generated content may be incorrect."/>
+                  <wp:cNvGraphicFramePr>
+                    <a:graphicFrameLocks xmlns:a="http://schemas.openxmlformats.org/drawingml/2006/main" noChangeAspect="1"/>
+                  </wp:cNvGraphicFramePr>
+                  <a:graphic xmlns:a="http://schemas.openxmlformats.org/drawingml/2006/main">
+                    <a:graphicData uri="http://schemas.openxmlformats.org/drawingml/2006/picture">
+                      <pic:pic xmlns:pic="http://schemas.openxmlformats.org/drawingml/2006/picture">
+                        <pic:nvPicPr>
+                          <pic:cNvPr id="291863030" name="Picture 1" descr="A screenshot of a login form&#10;&#10;AI-generated content may be incorrect."/>
+                          <pic:cNvPicPr/>
+                        </pic:nvPicPr>
+                        <pic:blipFill>
+                          <a:blip r:embed="rId15"/>
+                          <a:stretch>
+                            <a:fillRect/>
+                          </a:stretch>
+                        </pic:blipFill>
+                        <pic:spPr>
+                          <a:xfrm>
+                            <a:off x="0" y="0"/>
+                            <a:ext cx="2488893" cy="2878358"/>
+                          </a:xfrm>
+                          <a:prstGeom prst="rect">
+                            <a:avLst/>
+                          </a:prstGeom>
+                        </pic:spPr>
+                      </pic:pic>
+                    </a:graphicData>
+                  </a:graphic>
+                </wp:inline>
+              </w:drawing>
+            </w:r>
+          </w:p>
+        </w:tc>
+      </w:tr>
+    </w:tbl>
+    <w:p>
+      <w:pPr>
+        <w:pStyle w:val="ListParagraph"/>
+      </w:pPr>
+    </w:p>
+    <w:p/>
+    <w:p/>
+    <w:p>
+      <w:r>
+        <w:br w:type="page"/>
+      </w:r>
+    </w:p>
+    <w:p>
+      <w:pPr>
+        <w:rPr>
+          <w:b/>
+          <w:bCs/>
+        </w:rPr>
+      </w:pPr>
+      <w:r>
+        <w:rPr>
+          <w:b/>
+          <w:bCs/>
+        </w:rPr>
+        <w:lastRenderedPageBreak/>
+        <w:t>Bookshelf</w:t>
+      </w:r>
+    </w:p>
+    <w:p>
+      <w:pPr>
+        <w:pStyle w:val="ListParagraph"/>
+        <w:numPr>
+          <w:ilvl w:val="0"/>
+          <w:numId w:val="3"/>
+        </w:numPr>
+      </w:pPr>
+      <w:r>
+        <w:t>"Hello, username" displayed in top-left under the header</w:t>
+      </w:r>
+    </w:p>
+    <w:p>
+      <w:pPr>
+        <w:pStyle w:val="ListParagraph"/>
+        <w:numPr>
+          <w:ilvl w:val="0"/>
+          <w:numId w:val="3"/>
+        </w:numPr>
+      </w:pPr>
+      <w:r>
+        <w:t>Centered "Add Book+" button following normal design</w:t>
+      </w:r>
+    </w:p>
+    <w:p>
+      <w:pPr>
+        <w:pStyle w:val="ListParagraph"/>
+        <w:numPr>
+          <w:ilvl w:val="0"/>
+          <w:numId w:val="3"/>
+        </w:numPr>
+      </w:pPr>
+      <w:r>
+        <w:t>If no books are in the user's bookshelf, a plain text message is displayed.</w:t>
+      </w:r>
+    </w:p>
+    <w:p>
+      <w:pPr>
+        <w:pStyle w:val="ListParagraph"/>
+        <w:numPr>
+          <w:ilvl w:val="1"/>
+          <w:numId w:val="3"/>
+        </w:numPr>
+      </w:pPr>
+      <w:r>
+        <w:t>Message is currently "No books in your bookshelf yet!"</w:t>
+      </w:r>
+    </w:p>
+    <w:p>
+      <w:pPr>
+        <w:pStyle w:val="ListParagraph"/>
+        <w:numPr>
+          <w:ilvl w:val="1"/>
+          <w:numId w:val="3"/>
+        </w:numPr>
+      </w:pPr>
+      <w:r>
+        <w:t>Plain text that's centered under the "Add Book+"</w:t>
+      </w:r>
+    </w:p>
+    <w:p>
+      <w:pPr>
+        <w:pStyle w:val="ListParagraph"/>
+        <w:numPr>
+          <w:ilvl w:val="1"/>
+          <w:numId w:val="3"/>
+        </w:numPr>
+      </w:pPr>
+      <w:r>
+        <w:t xml:space="preserve">Same formatting as </w:t>
+      </w:r>
+      <w:r>
+        <w:t xml:space="preserve">standard </w:t>
+      </w:r>
+      <w:r>
+        <w:t>error messages</w:t>
+      </w:r>
+    </w:p>
+    <w:p>
+      <w:pPr>
+        <w:pStyle w:val="ListParagraph"/>
+        <w:numPr>
+          <w:ilvl w:val="0"/>
+          <w:numId w:val="3"/>
+        </w:numPr>
+      </w:pPr>
+      <w:r>
+        <w:t>All listed books have their own structured container</w:t>
+      </w:r>
+    </w:p>
+    <w:p>
+      <w:pPr>
+        <w:pStyle w:val="ListParagraph"/>
+        <w:numPr>
+          <w:ilvl w:val="1"/>
+          <w:numId w:val="3"/>
+        </w:numPr>
+      </w:pPr>
+      <w:r>
+        <w:t>Wide "rectangular" container with rounded edges with neutral color background</w:t>
+      </w:r>
+    </w:p>
+    <w:p>
+      <w:pPr>
+        <w:pStyle w:val="ListParagraph"/>
+        <w:numPr>
+          <w:ilvl w:val="1"/>
+          <w:numId w:val="3"/>
+        </w:numPr>
+      </w:pPr>
+      <w:r>
+        <w:t>Book cover thumbnails on the left are as tall as the container</w:t>
+      </w:r>
+    </w:p>
+    <w:p>
+      <w:pPr>
+        <w:pStyle w:val="ListParagraph"/>
+        <w:numPr>
+          <w:ilvl w:val="1"/>
+          <w:numId w:val="3"/>
+        </w:numPr>
+      </w:pPr>
+      <w:r>
+        <w:t>If no book cover available, plain placeholder image (which follows site design principles)</w:t>
+      </w:r>
+    </w:p>
+    <w:p>
+      <w:pPr>
+        <w:pStyle w:val="ListParagraph"/>
+        <w:numPr>
+          <w:ilvl w:val="1"/>
+          <w:numId w:val="3"/>
+        </w:numPr>
+      </w:pPr>
+      <w:r>
+        <w:t>Book title is double-sized font</w:t>
+      </w:r>
+    </w:p>
+    <w:p>
+      <w:pPr>
+        <w:pStyle w:val="ListParagraph"/>
+        <w:numPr>
+          <w:ilvl w:val="1"/>
+          <w:numId w:val="3"/>
+        </w:numPr>
+      </w:pPr>
+      <w:r>
+        <w:t>Other book information is standardized information text (black)</w:t>
+      </w:r>
+    </w:p>
+    <w:p>
+      <w:pPr>
+        <w:pStyle w:val="ListParagraph"/>
+        <w:numPr>
+          <w:ilvl w:val="2"/>
+          <w:numId w:val="3"/>
+        </w:numPr>
+      </w:pPr>
+      <w:r>
+        <w:t>Author</w:t>
+      </w:r>
+    </w:p>
+    <w:p>
+      <w:pPr>
+        <w:pStyle w:val="ListParagraph"/>
+        <w:numPr>
+          <w:ilvl w:val="2"/>
+          <w:numId w:val="3"/>
+        </w:numPr>
+      </w:pPr>
+      <w:r>
+        <w:t>Year of publication</w:t>
+      </w:r>
+    </w:p>
+    <w:p>
+      <w:pPr>
+        <w:pStyle w:val="ListParagraph"/>
+        <w:numPr>
+          <w:ilvl w:val="1"/>
+          <w:numId w:val="3"/>
+        </w:numPr>
+      </w:pPr>
+      <w:r>
+        <w:t>"Remove Book" button on right side of book container</w:t>
+      </w:r>
+    </w:p>
+    <w:p>
+      <w:pPr>
+        <w:pStyle w:val="ListParagraph"/>
+        <w:numPr>
+          <w:ilvl w:val="2"/>
+          <w:numId w:val="3"/>
+        </w:numPr>
+      </w:pPr>
+      <w:r>
+        <w:t>Rounded corners with normal button design</w:t>
+      </w:r>
+    </w:p>
+    <w:p>
+      <w:pPr>
+        <w:pStyle w:val="ListParagraph"/>
+        <w:numPr>
+          <w:ilvl w:val="2"/>
+          <w:numId w:val="3"/>
+        </w:numPr>
+      </w:pPr>
+      <w:r>
+        <w:t>Pushing the "Remove Book" button calls up a confirmation message</w:t>
+      </w:r>
+    </w:p>
+    <w:p>
+      <w:pPr>
+        <w:pStyle w:val="ListParagraph"/>
+        <w:numPr>
+          <w:ilvl w:val="3"/>
+          <w:numId w:val="3"/>
+        </w:numPr>
+      </w:pPr>
+      <w:r>
+        <w:t xml:space="preserve">Modal display is CSS element with "Yes, </w:t>
+      </w:r>
+      <w:proofErr w:type="gramStart"/>
+      <w:r>
+        <w:t>Remove</w:t>
+      </w:r>
+      <w:proofErr w:type="gramEnd"/>
+      <w:r>
+        <w:t>" and "Cancel" buttons</w:t>
+      </w:r>
+    </w:p>
+    <w:p>
+      <w:pPr>
+        <w:pStyle w:val="ListParagraph"/>
+        <w:numPr>
+          <w:ilvl w:val="3"/>
+          <w:numId w:val="3"/>
+        </w:numPr>
+      </w:pPr>
+      <w:r>
+        <w:t xml:space="preserve">Follows </w:t>
+      </w:r>
+      <w:r>
+        <w:t>site</w:t>
+      </w:r>
+      <w:r>
+        <w:t xml:space="preserve"> design principles for buttons</w:t>
+      </w:r>
+    </w:p>
+    <w:p>
+      <w:pPr>
+        <w:pStyle w:val="ListParagraph"/>
+        <w:numPr>
+          <w:ilvl w:val="3"/>
+          <w:numId w:val="3"/>
+        </w:numPr>
+      </w:pPr>
+      <w:r>
+        <w:t>Container itself uses the lavender (header) background colour to draw attention</w:t>
+      </w:r>
+    </w:p>
+    <w:p>
+      <w:pPr>
+        <w:pStyle w:val="ListParagraph"/>
+        <w:numPr>
+          <w:ilvl w:val="3"/>
+          <w:numId w:val="3"/>
+        </w:numPr>
+      </w:pPr>
+      <w:r>
+        <w:t>Page behind modal is dimmed to focus attention on modal</w:t>
+      </w:r>
+    </w:p>
+    <w:p/>
+    <w:p>
+      <w:pPr>
+        <w:jc w:val="center"/>
+      </w:pPr>
+      <w:r>
+        <w:rPr>
+          <w:noProof/>
+        </w:rPr>
+        <w:drawing>
+          <wp:inline distT="0" distB="0" distL="0" distR="0" wp14:anchorId="7427434F" wp14:editId="1EBF6E89">
+            <wp:extent cx="3239890" cy="2219325"/>
+            <wp:effectExtent l="0" t="0" r="0" b="0"/>
+            <wp:docPr id="403957443" name="Picture 1" descr="A screenshot of a web page&#10;&#10;AI-generated content may be incorrect."/>
+            <wp:cNvGraphicFramePr>
+              <a:graphicFrameLocks xmlns:a="http://schemas.openxmlformats.org/drawingml/2006/main" noChangeAspect="1"/>
+            </wp:cNvGraphicFramePr>
+            <a:graphic xmlns:a="http://schemas.openxmlformats.org/drawingml/2006/main">
+              <a:graphicData uri="http://schemas.openxmlformats.org/drawingml/2006/picture">
+                <pic:pic xmlns:pic="http://schemas.openxmlformats.org/drawingml/2006/picture">
+                  <pic:nvPicPr>
+                    <pic:cNvPr id="320964224" name="Picture 1" descr="A screenshot of a web page&#10;&#10;AI-generated content may be incorrect."/>
+                    <pic:cNvPicPr/>
+                  </pic:nvPicPr>
+                  <pic:blipFill>
+                    <a:blip r:embed="rId16"/>
+                    <a:stretch>
+                      <a:fillRect/>
+                    </a:stretch>
+                  </pic:blipFill>
+                  <pic:spPr>
+                    <a:xfrm>
+                      <a:off x="0" y="0"/>
+                      <a:ext cx="3252993" cy="2228301"/>
+                    </a:xfrm>
+                    <a:prstGeom prst="rect">
+                      <a:avLst/>
+                    </a:prstGeom>
+                  </pic:spPr>
+                </pic:pic>
+              </a:graphicData>
+            </a:graphic>
+          </wp:inline>
+        </w:drawing>
+      </w:r>
+      <w:r>
+        <w:drawing>
+          <wp:inline distT="0" distB="0" distL="0" distR="0" wp14:anchorId="20AB98AB" wp14:editId="720CAE10">
+            <wp:extent cx="3444875" cy="1812068"/>
+            <wp:effectExtent l="0" t="0" r="3175" b="0"/>
+            <wp:docPr id="1624075760" name="Picture 1" descr="A screenshot of a book&#10;&#10;AI-generated content may be incorrect."/>
+            <wp:cNvGraphicFramePr>
+              <a:graphicFrameLocks xmlns:a="http://schemas.openxmlformats.org/drawingml/2006/main" noChangeAspect="1"/>
+            </wp:cNvGraphicFramePr>
+            <a:graphic xmlns:a="http://schemas.openxmlformats.org/drawingml/2006/main">
+              <a:graphicData uri="http://schemas.openxmlformats.org/drawingml/2006/picture">
+                <pic:pic xmlns:pic="http://schemas.openxmlformats.org/drawingml/2006/picture">
+                  <pic:nvPicPr>
+                    <pic:cNvPr id="354775783" name="Picture 1" descr="A screenshot of a book&#10;&#10;AI-generated content may be incorrect."/>
+                    <pic:cNvPicPr/>
+                  </pic:nvPicPr>
+                  <pic:blipFill>
+                    <a:blip r:embed="rId17"/>
+                    <a:stretch>
+                      <a:fillRect/>
+                    </a:stretch>
+                  </pic:blipFill>
+                  <pic:spPr>
+                    <a:xfrm>
+                      <a:off x="0" y="0"/>
+                      <a:ext cx="3452190" cy="1815916"/>
+                    </a:xfrm>
+                    <a:prstGeom prst="rect">
+                      <a:avLst/>
+                    </a:prstGeom>
+                  </pic:spPr>
+                </pic:pic>
+              </a:graphicData>
+            </a:graphic>
+          </wp:inline>
+        </w:drawing>
+      </w:r>
+    </w:p>
+    <w:p>
+      <w:r>
+        <w:br w:type="page"/>
+      </w:r>
+    </w:p>
+    <w:p>
+      <w:pPr>
+        <w:rPr>
+          <w:b/>
+          <w:bCs/>
+        </w:rPr>
+      </w:pPr>
+      <w:r>
+        <w:rPr>
+          <w:b/>
+          <w:bCs/>
+        </w:rPr>
+        <w:lastRenderedPageBreak/>
+        <w:t>Search</w:t>
+      </w:r>
+    </w:p>
+    <w:p>
+      <w:pPr>
+        <w:pStyle w:val="ListParagraph"/>
+        <w:numPr>
+          <w:ilvl w:val="0"/>
+          <w:numId w:val="3"/>
+        </w:numPr>
+      </w:pPr>
+      <w:r>
+        <w:t xml:space="preserve">Page loads with </w:t>
+      </w:r>
+      <w:r>
+        <w:t>very wide (long)</w:t>
+      </w:r>
+      <w:r>
+        <w:t xml:space="preserve"> centered search bar with search button on the right.</w:t>
+      </w:r>
+    </w:p>
+    <w:p>
+      <w:pPr>
+        <w:pStyle w:val="ListParagraph"/>
+        <w:numPr>
+          <w:ilvl w:val="0"/>
+          <w:numId w:val="3"/>
+        </w:numPr>
+      </w:pPr>
+      <w:r>
+        <w:t xml:space="preserve">Search button has unique magnifying glass decoration, but otherwise </w:t>
+      </w:r>
+      <w:r>
+        <w:t>follows</w:t>
+      </w:r>
+      <w:r>
+        <w:t xml:space="preserve"> </w:t>
+      </w:r>
+      <w:r>
+        <w:t>site</w:t>
+      </w:r>
+      <w:r>
+        <w:t xml:space="preserve"> button design</w:t>
+      </w:r>
+    </w:p>
+    <w:p>
+      <w:pPr>
+        <w:pStyle w:val="ListParagraph"/>
+        <w:numPr>
+          <w:ilvl w:val="0"/>
+          <w:numId w:val="3"/>
+        </w:numPr>
+      </w:pPr>
+      <w:r>
+        <w:t>Once search button is clicked, list of search results loads</w:t>
+      </w:r>
+    </w:p>
+    <w:p>
+      <w:pPr>
+        <w:pStyle w:val="ListParagraph"/>
+        <w:numPr>
+          <w:ilvl w:val="1"/>
+          <w:numId w:val="3"/>
+        </w:numPr>
+      </w:pPr>
+      <w:r>
+        <w:t>Large text message appears under search bar to inform user that results are prepared</w:t>
+      </w:r>
+    </w:p>
+    <w:p>
+      <w:pPr>
+        <w:pStyle w:val="ListParagraph"/>
+        <w:numPr>
+          <w:ilvl w:val="2"/>
+          <w:numId w:val="3"/>
+        </w:numPr>
+      </w:pPr>
+      <w:r>
+        <w:t>'Search Results for "book title" '</w:t>
+      </w:r>
+    </w:p>
+    <w:p>
+      <w:pPr>
+        <w:pStyle w:val="ListParagraph"/>
+        <w:numPr>
+          <w:ilvl w:val="1"/>
+          <w:numId w:val="3"/>
+        </w:numPr>
+      </w:pPr>
+      <w:r>
+        <w:t xml:space="preserve">All search results display in their own container, </w:t>
+      </w:r>
+      <w:r>
+        <w:t>like</w:t>
+      </w:r>
+      <w:r>
+        <w:t xml:space="preserve"> Bookshelf results</w:t>
+      </w:r>
+    </w:p>
+    <w:p>
+      <w:pPr>
+        <w:pStyle w:val="ListParagraph"/>
+        <w:numPr>
+          <w:ilvl w:val="2"/>
+          <w:numId w:val="3"/>
+        </w:numPr>
+      </w:pPr>
+      <w:r>
+        <w:t>Wide "rectangular" container with rounded edges with neutral color background</w:t>
+      </w:r>
+    </w:p>
+    <w:p>
+      <w:pPr>
+        <w:pStyle w:val="ListParagraph"/>
+        <w:numPr>
+          <w:ilvl w:val="2"/>
+          <w:numId w:val="3"/>
+        </w:numPr>
+      </w:pPr>
+      <w:r>
+        <w:t>"+ Add Book" button on right side of book container</w:t>
+      </w:r>
+    </w:p>
+    <w:p>
+      <w:pPr>
+        <w:pStyle w:val="ListParagraph"/>
+        <w:numPr>
+          <w:ilvl w:val="2"/>
+          <w:numId w:val="3"/>
+        </w:numPr>
+      </w:pPr>
+      <w:r>
+        <w:t>Rounded corners with normal button design</w:t>
+      </w:r>
+    </w:p>
+    <w:p>
+      <w:pPr>
+        <w:pStyle w:val="ListParagraph"/>
+        <w:numPr>
+          <w:ilvl w:val="2"/>
+          <w:numId w:val="3"/>
+        </w:numPr>
+      </w:pPr>
+      <w:r>
+        <w:t>Book cover thumbnails on the left are as tall as the container</w:t>
+      </w:r>
+    </w:p>
+    <w:p>
+      <w:pPr>
+        <w:pStyle w:val="ListParagraph"/>
+        <w:numPr>
+          <w:ilvl w:val="2"/>
+          <w:numId w:val="3"/>
+        </w:numPr>
+      </w:pPr>
+      <w:r>
+        <w:t>Book title is double-sized font</w:t>
+      </w:r>
+    </w:p>
+    <w:p>
+      <w:pPr>
+        <w:pStyle w:val="ListParagraph"/>
+        <w:numPr>
+          <w:ilvl w:val="2"/>
+          <w:numId w:val="3"/>
+        </w:numPr>
+      </w:pPr>
+      <w:r>
+        <w:t>Other book information is standardized information text (black)</w:t>
+      </w:r>
+    </w:p>
+    <w:p>
+      <w:pPr>
+        <w:pStyle w:val="ListParagraph"/>
+        <w:numPr>
+          <w:ilvl w:val="3"/>
+          <w:numId w:val="3"/>
+        </w:numPr>
+      </w:pPr>
+      <w:r>
+        <w:t>Author</w:t>
+      </w:r>
+    </w:p>
+    <w:p>
+      <w:pPr>
+        <w:pStyle w:val="ListParagraph"/>
+        <w:numPr>
+          <w:ilvl w:val="3"/>
+          <w:numId w:val="3"/>
+        </w:numPr>
+      </w:pPr>
+      <w:r>
+        <w:t>ISBN</w:t>
+      </w:r>
+    </w:p>
+    <w:p>
+      <w:pPr>
+        <w:pStyle w:val="ListParagraph"/>
+        <w:numPr>
+          <w:ilvl w:val="3"/>
+          <w:numId w:val="3"/>
+        </w:numPr>
+      </w:pPr>
+      <w:r>
+        <w:t>"Published by"</w:t>
+      </w:r>
+    </w:p>
+    <w:p>
+      <w:pPr>
+        <w:pStyle w:val="ListParagraph"/>
+        <w:numPr>
+          <w:ilvl w:val="3"/>
+          <w:numId w:val="3"/>
+        </w:numPr>
+      </w:pPr>
+      <w:r>
+        <w:t>Description</w:t>
+      </w:r>
+    </w:p>
+    <w:p>
+      <w:pPr>
+        <w:pStyle w:val="ListParagraph"/>
+        <w:numPr>
+          <w:ilvl w:val="2"/>
+          <w:numId w:val="3"/>
+        </w:numPr>
+      </w:pPr>
+      <w:r>
+        <w:t>Description is hidden until user hovers over the container. The container expands to reveal the Description and extends vertically.</w:t>
+      </w:r>
+    </w:p>
+    <w:p>
+      <w:pPr>
+        <w:pStyle w:val="ListParagraph"/>
+        <w:numPr>
+          <w:ilvl w:val="2"/>
+          <w:numId w:val="3"/>
+        </w:numPr>
+      </w:pPr>
+      <w:r>
+        <w:t>Search result containers stack vertically, allowing user to browse them by scrolling down.  </w:t>
+      </w:r>
+    </w:p>
+    <w:p>
+      <w:pPr>
+        <w:jc w:val="center"/>
+      </w:pPr>
+      <w:r>
+        <w:rPr>
+          <w:noProof/>
+        </w:rPr>
+        <w:drawing>
+          <wp:inline distT="0" distB="0" distL="0" distR="0" wp14:anchorId="4EC1A527" wp14:editId="10144B6F">
+            <wp:extent cx="5264150" cy="3626902"/>
+            <wp:effectExtent l="0" t="0" r="0" b="0"/>
+            <wp:docPr id="920607514" name="Picture 1" descr="A screenshot of a search engine&#10;&#10;AI-generated content may be incorrect."/>
+            <wp:cNvGraphicFramePr>
+              <a:graphicFrameLocks xmlns:a="http://schemas.openxmlformats.org/drawingml/2006/main" noChangeAspect="1"/>
+            </wp:cNvGraphicFramePr>
+            <a:graphic xmlns:a="http://schemas.openxmlformats.org/drawingml/2006/main">
+              <a:graphicData uri="http://schemas.openxmlformats.org/drawingml/2006/picture">
+                <pic:pic xmlns:pic="http://schemas.openxmlformats.org/drawingml/2006/picture">
+                  <pic:nvPicPr>
+                    <pic:cNvPr id="549687251" name="Picture 1" descr="A screenshot of a search engine&#10;&#10;AI-generated content may be incorrect."/>
+                    <pic:cNvPicPr/>
+                  </pic:nvPicPr>
+                  <pic:blipFill>
+                    <a:blip r:embed="rId18"/>
+                    <a:stretch>
+                      <a:fillRect/>
+                    </a:stretch>
+                  </pic:blipFill>
+                  <pic:spPr>
+                    <a:xfrm>
+                      <a:off x="0" y="0"/>
+                      <a:ext cx="5276580" cy="3635466"/>
+                    </a:xfrm>
+                    <a:prstGeom prst="rect">
+                      <a:avLst/>
+                    </a:prstGeom>
+                  </pic:spPr>
+                </pic:pic>
+              </a:graphicData>
+            </a:graphic>
+          </wp:inline>
+        </w:drawing>
+      </w:r>
+    </w:p>
+    <w:p/>
     <w:sectPr>
+      <w:headerReference w:type="default" r:id="rId19"/>
       <w:pgSz w:w="12240" w:h="15840"/>
-      <w:pgMar w:top="1440" w:right="1440" w:bottom="1440" w:left="1440" w:header="708" w:footer="708" w:gutter="0"/>
+      <w:pgMar w:top="720" w:right="720" w:bottom="720" w:left="720" w:header="708" w:footer="708" w:gutter="0"/>
       <w:cols w:space="708"/>
       <w:docGrid w:linePitch="360"/>
     </w:sectPr>
@@ -340,6 +2631,1645 @@
     </w:p>
   </w:footnote>
 </w:footnotes>
+</file>
+
+<file path=word/header1.xml><?xml version="1.0" encoding="utf-8"?>
+<w:hdr xmlns:wpc="http://schemas.microsoft.com/office/word/2010/wordprocessingCanvas" xmlns:cx="http://schemas.microsoft.com/office/drawing/2014/chartex" xmlns:cx1="http://schemas.microsoft.com/office/drawing/2015/9/8/chartex" xmlns:cx2="http://schemas.microsoft.com/office/drawing/2015/10/21/chartex" xmlns:cx3="http://schemas.microsoft.com/office/drawing/2016/5/9/chartex" xmlns:cx4="http://schemas.microsoft.com/office/drawing/2016/5/10/chartex" xmlns:cx5="http://schemas.microsoft.com/office/drawing/2016/5/11/chartex" xmlns:cx6="http://schemas.microsoft.com/office/drawing/2016/5/12/chartex" xmlns:cx7="http://schemas.microsoft.com/office/drawing/2016/5/13/chartex" xmlns:cx8="http://schemas.microsoft.com/office/drawing/2016/5/14/chartex" xmlns:mc="http://schemas.openxmlformats.org/markup-compatibility/2006" xmlns:aink="http://schemas.microsoft.com/office/drawing/2016/ink" xmlns:am3d="http://schemas.microsoft.com/office/drawing/2017/model3d" xmlns:o="urn:schemas-microsoft-com:office:office" xmlns:oel="http://schemas.microsoft.com/office/2019/extlst" xmlns:r="http://schemas.openxmlformats.org/officeDocument/2006/relationships" xmlns:m="http://schemas.openxmlformats.org/officeDocument/2006/math" xmlns:v="urn:schemas-microsoft-com:vml" xmlns:wp14="http://schemas.microsoft.com/office/word/2010/wordprocessingDrawing" xmlns:wp="http://schemas.openxmlformats.org/drawingml/2006/wordprocessingDrawing" xmlns:w10="urn:schemas-microsoft-com:office:word" xmlns:w="http://schemas.openxmlformats.org/wordprocessingml/2006/main" xmlns:w14="http://schemas.microsoft.com/office/word/2010/wordml" xmlns:w15="http://schemas.microsoft.com/office/word/2012/wordml" xmlns:w16cex="http://schemas.microsoft.com/office/word/2018/wordml/cex" xmlns:w16cid="http://schemas.microsoft.com/office/word/2016/wordml/cid" xmlns:w16="http://schemas.microsoft.com/office/word/2018/wordml" xmlns:w16du="http://schemas.microsoft.com/office/word/2023/wordml/word16du" xmlns:w16sdtdh="http://schemas.microsoft.com/office/word/2020/wordml/sdtdatahash" xmlns:w16sdtfl="http://schemas.microsoft.com/office/word/2024/wordml/sdtformatlock" xmlns:w16se="http://schemas.microsoft.com/office/word/2015/wordml/symex" xmlns:wpg="http://schemas.microsoft.com/office/word/2010/wordprocessingGroup" xmlns:wpi="http://schemas.microsoft.com/office/word/2010/wordprocessingInk" xmlns:wne="http://schemas.microsoft.com/office/word/2006/wordml" xmlns:wps="http://schemas.microsoft.com/office/word/2010/wordprocessingShape" mc:Ignorable="w14 w15 w16se w16cid w16 w16cex w16sdtdh w16sdtfl w16du wp14">
+  <w:p>
+    <w:pPr>
+      <w:pStyle w:val="Header"/>
+      <w:jc w:val="right"/>
+    </w:pPr>
+    <w:r>
+      <w:t>Jonathan Latkowcer</w:t>
+    </w:r>
+  </w:p>
+  <w:p>
+    <w:pPr>
+      <w:pStyle w:val="Header"/>
+      <w:jc w:val="right"/>
+    </w:pPr>
+    <w:r>
+      <w:t>Team Leader, booked Development Team</w:t>
+    </w:r>
+  </w:p>
+</w:hdr>
+</file>
+
+<file path=word/numbering.xml><?xml version="1.0" encoding="utf-8"?>
+<w:numbering xmlns:wpc="http://schemas.microsoft.com/office/word/2010/wordprocessingCanvas" xmlns:cx="http://schemas.microsoft.com/office/drawing/2014/chartex" xmlns:cx1="http://schemas.microsoft.com/office/drawing/2015/9/8/chartex" xmlns:cx2="http://schemas.microsoft.com/office/drawing/2015/10/21/chartex" xmlns:cx3="http://schemas.microsoft.com/office/drawing/2016/5/9/chartex" xmlns:cx4="http://schemas.microsoft.com/office/drawing/2016/5/10/chartex" xmlns:cx5="http://schemas.microsoft.com/office/drawing/2016/5/11/chartex" xmlns:cx6="http://schemas.microsoft.com/office/drawing/2016/5/12/chartex" xmlns:cx7="http://schemas.microsoft.com/office/drawing/2016/5/13/chartex" xmlns:cx8="http://schemas.microsoft.com/office/drawing/2016/5/14/chartex" xmlns:mc="http://schemas.openxmlformats.org/markup-compatibility/2006" xmlns:aink="http://schemas.microsoft.com/office/drawing/2016/ink" xmlns:am3d="http://schemas.microsoft.com/office/drawing/2017/model3d" xmlns:o="urn:schemas-microsoft-com:office:office" xmlns:oel="http://schemas.microsoft.com/office/2019/extlst" xmlns:r="http://schemas.openxmlformats.org/officeDocument/2006/relationships" xmlns:m="http://schemas.openxmlformats.org/officeDocument/2006/math" xmlns:v="urn:schemas-microsoft-com:vml" xmlns:wp14="http://schemas.microsoft.com/office/word/2010/wordprocessingDrawing" xmlns:wp="http://schemas.openxmlformats.org/drawingml/2006/wordprocessingDrawing" xmlns:w10="urn:schemas-microsoft-com:office:word" xmlns:w="http://schemas.openxmlformats.org/wordprocessingml/2006/main" xmlns:w14="http://schemas.microsoft.com/office/word/2010/wordml" xmlns:w15="http://schemas.microsoft.com/office/word/2012/wordml" xmlns:w16cex="http://schemas.microsoft.com/office/word/2018/wordml/cex" xmlns:w16cid="http://schemas.microsoft.com/office/word/2016/wordml/cid" xmlns:w16="http://schemas.microsoft.com/office/word/2018/wordml" xmlns:w16du="http://schemas.microsoft.com/office/word/2023/wordml/word16du" xmlns:w16sdtdh="http://schemas.microsoft.com/office/word/2020/wordml/sdtdatahash" xmlns:w16sdtfl="http://schemas.microsoft.com/office/word/2024/wordml/sdtformatlock" xmlns:w16se="http://schemas.microsoft.com/office/word/2015/wordml/symex" xmlns:wpg="http://schemas.microsoft.com/office/word/2010/wordprocessingGroup" xmlns:wpi="http://schemas.microsoft.com/office/word/2010/wordprocessingInk" xmlns:wne="http://schemas.microsoft.com/office/word/2006/wordml" xmlns:wps="http://schemas.microsoft.com/office/word/2010/wordprocessingShape" mc:Ignorable="w14 w15 w16se w16cid w16 w16cex w16sdtdh w16sdtfl w16du wp14">
+  <w:abstractNum w:abstractNumId="0" w15:restartNumberingAfterBreak="0">
+    <w:nsid w:val="043E729A"/>
+    <w:multiLevelType w:val="hybridMultilevel"/>
+    <w:tmpl w:val="78D06722"/>
+    <w:lvl w:ilvl="0" w:tplc="C2A4B4E0">
+      <w:numFmt w:val="bullet"/>
+      <w:lvlText w:val="-"/>
+      <w:lvlJc w:val="left"/>
+      <w:pPr>
+        <w:ind w:left="720" w:hanging="360"/>
+      </w:pPr>
+      <w:rPr>
+        <w:rFonts w:ascii="Aptos" w:eastAsiaTheme="minorHAnsi" w:hAnsi="Aptos" w:cstheme="minorBidi" w:hint="default"/>
+      </w:rPr>
+    </w:lvl>
+    <w:lvl w:ilvl="1" w:tplc="10090003" w:tentative="1">
+      <w:start w:val="1"/>
+      <w:numFmt w:val="bullet"/>
+      <w:lvlText w:val="o"/>
+      <w:lvlJc w:val="left"/>
+      <w:pPr>
+        <w:ind w:left="1440" w:hanging="360"/>
+      </w:pPr>
+      <w:rPr>
+        <w:rFonts w:ascii="Courier New" w:hAnsi="Courier New" w:cs="Courier New" w:hint="default"/>
+      </w:rPr>
+    </w:lvl>
+    <w:lvl w:ilvl="2" w:tplc="10090005" w:tentative="1">
+      <w:start w:val="1"/>
+      <w:numFmt w:val="bullet"/>
+      <w:lvlText w:val=""/>
+      <w:lvlJc w:val="left"/>
+      <w:pPr>
+        <w:ind w:left="2160" w:hanging="360"/>
+      </w:pPr>
+      <w:rPr>
+        <w:rFonts w:ascii="Wingdings" w:hAnsi="Wingdings" w:hint="default"/>
+      </w:rPr>
+    </w:lvl>
+    <w:lvl w:ilvl="3" w:tplc="10090001" w:tentative="1">
+      <w:start w:val="1"/>
+      <w:numFmt w:val="bullet"/>
+      <w:lvlText w:val=""/>
+      <w:lvlJc w:val="left"/>
+      <w:pPr>
+        <w:ind w:left="2880" w:hanging="360"/>
+      </w:pPr>
+      <w:rPr>
+        <w:rFonts w:ascii="Symbol" w:hAnsi="Symbol" w:hint="default"/>
+      </w:rPr>
+    </w:lvl>
+    <w:lvl w:ilvl="4" w:tplc="10090003" w:tentative="1">
+      <w:start w:val="1"/>
+      <w:numFmt w:val="bullet"/>
+      <w:lvlText w:val="o"/>
+      <w:lvlJc w:val="left"/>
+      <w:pPr>
+        <w:ind w:left="3600" w:hanging="360"/>
+      </w:pPr>
+      <w:rPr>
+        <w:rFonts w:ascii="Courier New" w:hAnsi="Courier New" w:cs="Courier New" w:hint="default"/>
+      </w:rPr>
+    </w:lvl>
+    <w:lvl w:ilvl="5" w:tplc="10090005" w:tentative="1">
+      <w:start w:val="1"/>
+      <w:numFmt w:val="bullet"/>
+      <w:lvlText w:val=""/>
+      <w:lvlJc w:val="left"/>
+      <w:pPr>
+        <w:ind w:left="4320" w:hanging="360"/>
+      </w:pPr>
+      <w:rPr>
+        <w:rFonts w:ascii="Wingdings" w:hAnsi="Wingdings" w:hint="default"/>
+      </w:rPr>
+    </w:lvl>
+    <w:lvl w:ilvl="6" w:tplc="10090001" w:tentative="1">
+      <w:start w:val="1"/>
+      <w:numFmt w:val="bullet"/>
+      <w:lvlText w:val=""/>
+      <w:lvlJc w:val="left"/>
+      <w:pPr>
+        <w:ind w:left="5040" w:hanging="360"/>
+      </w:pPr>
+      <w:rPr>
+        <w:rFonts w:ascii="Symbol" w:hAnsi="Symbol" w:hint="default"/>
+      </w:rPr>
+    </w:lvl>
+    <w:lvl w:ilvl="7" w:tplc="10090003" w:tentative="1">
+      <w:start w:val="1"/>
+      <w:numFmt w:val="bullet"/>
+      <w:lvlText w:val="o"/>
+      <w:lvlJc w:val="left"/>
+      <w:pPr>
+        <w:ind w:left="5760" w:hanging="360"/>
+      </w:pPr>
+      <w:rPr>
+        <w:rFonts w:ascii="Courier New" w:hAnsi="Courier New" w:cs="Courier New" w:hint="default"/>
+      </w:rPr>
+    </w:lvl>
+    <w:lvl w:ilvl="8" w:tplc="10090005" w:tentative="1">
+      <w:start w:val="1"/>
+      <w:numFmt w:val="bullet"/>
+      <w:lvlText w:val=""/>
+      <w:lvlJc w:val="left"/>
+      <w:pPr>
+        <w:ind w:left="6480" w:hanging="360"/>
+      </w:pPr>
+      <w:rPr>
+        <w:rFonts w:ascii="Wingdings" w:hAnsi="Wingdings" w:hint="default"/>
+      </w:rPr>
+    </w:lvl>
+  </w:abstractNum>
+  <w:abstractNum w:abstractNumId="1" w15:restartNumberingAfterBreak="0">
+    <w:nsid w:val="06867314"/>
+    <w:multiLevelType w:val="hybridMultilevel"/>
+    <w:tmpl w:val="1DE4FCC2"/>
+    <w:lvl w:ilvl="0" w:tplc="E500BC50">
+      <w:numFmt w:val="bullet"/>
+      <w:lvlText w:val="-"/>
+      <w:lvlJc w:val="left"/>
+      <w:pPr>
+        <w:ind w:left="720" w:hanging="360"/>
+      </w:pPr>
+      <w:rPr>
+        <w:rFonts w:ascii="Aptos" w:eastAsiaTheme="minorHAnsi" w:hAnsi="Aptos" w:cstheme="minorBidi" w:hint="default"/>
+      </w:rPr>
+    </w:lvl>
+    <w:lvl w:ilvl="1" w:tplc="10090003" w:tentative="1">
+      <w:start w:val="1"/>
+      <w:numFmt w:val="bullet"/>
+      <w:lvlText w:val="o"/>
+      <w:lvlJc w:val="left"/>
+      <w:pPr>
+        <w:ind w:left="1440" w:hanging="360"/>
+      </w:pPr>
+      <w:rPr>
+        <w:rFonts w:ascii="Courier New" w:hAnsi="Courier New" w:cs="Courier New" w:hint="default"/>
+      </w:rPr>
+    </w:lvl>
+    <w:lvl w:ilvl="2" w:tplc="10090005" w:tentative="1">
+      <w:start w:val="1"/>
+      <w:numFmt w:val="bullet"/>
+      <w:lvlText w:val=""/>
+      <w:lvlJc w:val="left"/>
+      <w:pPr>
+        <w:ind w:left="2160" w:hanging="360"/>
+      </w:pPr>
+      <w:rPr>
+        <w:rFonts w:ascii="Wingdings" w:hAnsi="Wingdings" w:hint="default"/>
+      </w:rPr>
+    </w:lvl>
+    <w:lvl w:ilvl="3" w:tplc="10090001" w:tentative="1">
+      <w:start w:val="1"/>
+      <w:numFmt w:val="bullet"/>
+      <w:lvlText w:val=""/>
+      <w:lvlJc w:val="left"/>
+      <w:pPr>
+        <w:ind w:left="2880" w:hanging="360"/>
+      </w:pPr>
+      <w:rPr>
+        <w:rFonts w:ascii="Symbol" w:hAnsi="Symbol" w:hint="default"/>
+      </w:rPr>
+    </w:lvl>
+    <w:lvl w:ilvl="4" w:tplc="10090003" w:tentative="1">
+      <w:start w:val="1"/>
+      <w:numFmt w:val="bullet"/>
+      <w:lvlText w:val="o"/>
+      <w:lvlJc w:val="left"/>
+      <w:pPr>
+        <w:ind w:left="3600" w:hanging="360"/>
+      </w:pPr>
+      <w:rPr>
+        <w:rFonts w:ascii="Courier New" w:hAnsi="Courier New" w:cs="Courier New" w:hint="default"/>
+      </w:rPr>
+    </w:lvl>
+    <w:lvl w:ilvl="5" w:tplc="10090005" w:tentative="1">
+      <w:start w:val="1"/>
+      <w:numFmt w:val="bullet"/>
+      <w:lvlText w:val=""/>
+      <w:lvlJc w:val="left"/>
+      <w:pPr>
+        <w:ind w:left="4320" w:hanging="360"/>
+      </w:pPr>
+      <w:rPr>
+        <w:rFonts w:ascii="Wingdings" w:hAnsi="Wingdings" w:hint="default"/>
+      </w:rPr>
+    </w:lvl>
+    <w:lvl w:ilvl="6" w:tplc="10090001" w:tentative="1">
+      <w:start w:val="1"/>
+      <w:numFmt w:val="bullet"/>
+      <w:lvlText w:val=""/>
+      <w:lvlJc w:val="left"/>
+      <w:pPr>
+        <w:ind w:left="5040" w:hanging="360"/>
+      </w:pPr>
+      <w:rPr>
+        <w:rFonts w:ascii="Symbol" w:hAnsi="Symbol" w:hint="default"/>
+      </w:rPr>
+    </w:lvl>
+    <w:lvl w:ilvl="7" w:tplc="10090003" w:tentative="1">
+      <w:start w:val="1"/>
+      <w:numFmt w:val="bullet"/>
+      <w:lvlText w:val="o"/>
+      <w:lvlJc w:val="left"/>
+      <w:pPr>
+        <w:ind w:left="5760" w:hanging="360"/>
+      </w:pPr>
+      <w:rPr>
+        <w:rFonts w:ascii="Courier New" w:hAnsi="Courier New" w:cs="Courier New" w:hint="default"/>
+      </w:rPr>
+    </w:lvl>
+    <w:lvl w:ilvl="8" w:tplc="10090005" w:tentative="1">
+      <w:start w:val="1"/>
+      <w:numFmt w:val="bullet"/>
+      <w:lvlText w:val=""/>
+      <w:lvlJc w:val="left"/>
+      <w:pPr>
+        <w:ind w:left="6480" w:hanging="360"/>
+      </w:pPr>
+      <w:rPr>
+        <w:rFonts w:ascii="Wingdings" w:hAnsi="Wingdings" w:hint="default"/>
+      </w:rPr>
+    </w:lvl>
+  </w:abstractNum>
+  <w:abstractNum w:abstractNumId="2" w15:restartNumberingAfterBreak="0">
+    <w:nsid w:val="09AD67F9"/>
+    <w:multiLevelType w:val="hybridMultilevel"/>
+    <w:tmpl w:val="0936C5C0"/>
+    <w:lvl w:ilvl="0" w:tplc="E500BC50">
+      <w:numFmt w:val="bullet"/>
+      <w:lvlText w:val="-"/>
+      <w:lvlJc w:val="left"/>
+      <w:pPr>
+        <w:ind w:left="720" w:hanging="360"/>
+      </w:pPr>
+      <w:rPr>
+        <w:rFonts w:ascii="Aptos" w:eastAsiaTheme="minorHAnsi" w:hAnsi="Aptos" w:cstheme="minorBidi" w:hint="default"/>
+      </w:rPr>
+    </w:lvl>
+    <w:lvl w:ilvl="1" w:tplc="10090003" w:tentative="1">
+      <w:start w:val="1"/>
+      <w:numFmt w:val="bullet"/>
+      <w:lvlText w:val="o"/>
+      <w:lvlJc w:val="left"/>
+      <w:pPr>
+        <w:ind w:left="1440" w:hanging="360"/>
+      </w:pPr>
+      <w:rPr>
+        <w:rFonts w:ascii="Courier New" w:hAnsi="Courier New" w:cs="Courier New" w:hint="default"/>
+      </w:rPr>
+    </w:lvl>
+    <w:lvl w:ilvl="2" w:tplc="10090005" w:tentative="1">
+      <w:start w:val="1"/>
+      <w:numFmt w:val="bullet"/>
+      <w:lvlText w:val=""/>
+      <w:lvlJc w:val="left"/>
+      <w:pPr>
+        <w:ind w:left="2160" w:hanging="360"/>
+      </w:pPr>
+      <w:rPr>
+        <w:rFonts w:ascii="Wingdings" w:hAnsi="Wingdings" w:hint="default"/>
+      </w:rPr>
+    </w:lvl>
+    <w:lvl w:ilvl="3" w:tplc="10090001" w:tentative="1">
+      <w:start w:val="1"/>
+      <w:numFmt w:val="bullet"/>
+      <w:lvlText w:val=""/>
+      <w:lvlJc w:val="left"/>
+      <w:pPr>
+        <w:ind w:left="2880" w:hanging="360"/>
+      </w:pPr>
+      <w:rPr>
+        <w:rFonts w:ascii="Symbol" w:hAnsi="Symbol" w:hint="default"/>
+      </w:rPr>
+    </w:lvl>
+    <w:lvl w:ilvl="4" w:tplc="10090003" w:tentative="1">
+      <w:start w:val="1"/>
+      <w:numFmt w:val="bullet"/>
+      <w:lvlText w:val="o"/>
+      <w:lvlJc w:val="left"/>
+      <w:pPr>
+        <w:ind w:left="3600" w:hanging="360"/>
+      </w:pPr>
+      <w:rPr>
+        <w:rFonts w:ascii="Courier New" w:hAnsi="Courier New" w:cs="Courier New" w:hint="default"/>
+      </w:rPr>
+    </w:lvl>
+    <w:lvl w:ilvl="5" w:tplc="10090005" w:tentative="1">
+      <w:start w:val="1"/>
+      <w:numFmt w:val="bullet"/>
+      <w:lvlText w:val=""/>
+      <w:lvlJc w:val="left"/>
+      <w:pPr>
+        <w:ind w:left="4320" w:hanging="360"/>
+      </w:pPr>
+      <w:rPr>
+        <w:rFonts w:ascii="Wingdings" w:hAnsi="Wingdings" w:hint="default"/>
+      </w:rPr>
+    </w:lvl>
+    <w:lvl w:ilvl="6" w:tplc="10090001" w:tentative="1">
+      <w:start w:val="1"/>
+      <w:numFmt w:val="bullet"/>
+      <w:lvlText w:val=""/>
+      <w:lvlJc w:val="left"/>
+      <w:pPr>
+        <w:ind w:left="5040" w:hanging="360"/>
+      </w:pPr>
+      <w:rPr>
+        <w:rFonts w:ascii="Symbol" w:hAnsi="Symbol" w:hint="default"/>
+      </w:rPr>
+    </w:lvl>
+    <w:lvl w:ilvl="7" w:tplc="10090003" w:tentative="1">
+      <w:start w:val="1"/>
+      <w:numFmt w:val="bullet"/>
+      <w:lvlText w:val="o"/>
+      <w:lvlJc w:val="left"/>
+      <w:pPr>
+        <w:ind w:left="5760" w:hanging="360"/>
+      </w:pPr>
+      <w:rPr>
+        <w:rFonts w:ascii="Courier New" w:hAnsi="Courier New" w:cs="Courier New" w:hint="default"/>
+      </w:rPr>
+    </w:lvl>
+    <w:lvl w:ilvl="8" w:tplc="10090005" w:tentative="1">
+      <w:start w:val="1"/>
+      <w:numFmt w:val="bullet"/>
+      <w:lvlText w:val=""/>
+      <w:lvlJc w:val="left"/>
+      <w:pPr>
+        <w:ind w:left="6480" w:hanging="360"/>
+      </w:pPr>
+      <w:rPr>
+        <w:rFonts w:ascii="Wingdings" w:hAnsi="Wingdings" w:hint="default"/>
+      </w:rPr>
+    </w:lvl>
+  </w:abstractNum>
+  <w:abstractNum w:abstractNumId="3" w15:restartNumberingAfterBreak="0">
+    <w:nsid w:val="1BB94C5E"/>
+    <w:multiLevelType w:val="hybridMultilevel"/>
+    <w:tmpl w:val="0D68D396"/>
+    <w:lvl w:ilvl="0" w:tplc="E500BC50">
+      <w:numFmt w:val="bullet"/>
+      <w:lvlText w:val="-"/>
+      <w:lvlJc w:val="left"/>
+      <w:pPr>
+        <w:ind w:left="1440" w:hanging="360"/>
+      </w:pPr>
+      <w:rPr>
+        <w:rFonts w:ascii="Aptos" w:eastAsiaTheme="minorHAnsi" w:hAnsi="Aptos" w:cstheme="minorBidi" w:hint="default"/>
+      </w:rPr>
+    </w:lvl>
+    <w:lvl w:ilvl="1" w:tplc="10090003" w:tentative="1">
+      <w:start w:val="1"/>
+      <w:numFmt w:val="bullet"/>
+      <w:lvlText w:val="o"/>
+      <w:lvlJc w:val="left"/>
+      <w:pPr>
+        <w:ind w:left="2160" w:hanging="360"/>
+      </w:pPr>
+      <w:rPr>
+        <w:rFonts w:ascii="Courier New" w:hAnsi="Courier New" w:cs="Courier New" w:hint="default"/>
+      </w:rPr>
+    </w:lvl>
+    <w:lvl w:ilvl="2" w:tplc="10090005" w:tentative="1">
+      <w:start w:val="1"/>
+      <w:numFmt w:val="bullet"/>
+      <w:lvlText w:val=""/>
+      <w:lvlJc w:val="left"/>
+      <w:pPr>
+        <w:ind w:left="2880" w:hanging="360"/>
+      </w:pPr>
+      <w:rPr>
+        <w:rFonts w:ascii="Wingdings" w:hAnsi="Wingdings" w:hint="default"/>
+      </w:rPr>
+    </w:lvl>
+    <w:lvl w:ilvl="3" w:tplc="10090001" w:tentative="1">
+      <w:start w:val="1"/>
+      <w:numFmt w:val="bullet"/>
+      <w:lvlText w:val=""/>
+      <w:lvlJc w:val="left"/>
+      <w:pPr>
+        <w:ind w:left="3600" w:hanging="360"/>
+      </w:pPr>
+      <w:rPr>
+        <w:rFonts w:ascii="Symbol" w:hAnsi="Symbol" w:hint="default"/>
+      </w:rPr>
+    </w:lvl>
+    <w:lvl w:ilvl="4" w:tplc="10090003" w:tentative="1">
+      <w:start w:val="1"/>
+      <w:numFmt w:val="bullet"/>
+      <w:lvlText w:val="o"/>
+      <w:lvlJc w:val="left"/>
+      <w:pPr>
+        <w:ind w:left="4320" w:hanging="360"/>
+      </w:pPr>
+      <w:rPr>
+        <w:rFonts w:ascii="Courier New" w:hAnsi="Courier New" w:cs="Courier New" w:hint="default"/>
+      </w:rPr>
+    </w:lvl>
+    <w:lvl w:ilvl="5" w:tplc="10090005" w:tentative="1">
+      <w:start w:val="1"/>
+      <w:numFmt w:val="bullet"/>
+      <w:lvlText w:val=""/>
+      <w:lvlJc w:val="left"/>
+      <w:pPr>
+        <w:ind w:left="5040" w:hanging="360"/>
+      </w:pPr>
+      <w:rPr>
+        <w:rFonts w:ascii="Wingdings" w:hAnsi="Wingdings" w:hint="default"/>
+      </w:rPr>
+    </w:lvl>
+    <w:lvl w:ilvl="6" w:tplc="10090001" w:tentative="1">
+      <w:start w:val="1"/>
+      <w:numFmt w:val="bullet"/>
+      <w:lvlText w:val=""/>
+      <w:lvlJc w:val="left"/>
+      <w:pPr>
+        <w:ind w:left="5760" w:hanging="360"/>
+      </w:pPr>
+      <w:rPr>
+        <w:rFonts w:ascii="Symbol" w:hAnsi="Symbol" w:hint="default"/>
+      </w:rPr>
+    </w:lvl>
+    <w:lvl w:ilvl="7" w:tplc="10090003" w:tentative="1">
+      <w:start w:val="1"/>
+      <w:numFmt w:val="bullet"/>
+      <w:lvlText w:val="o"/>
+      <w:lvlJc w:val="left"/>
+      <w:pPr>
+        <w:ind w:left="6480" w:hanging="360"/>
+      </w:pPr>
+      <w:rPr>
+        <w:rFonts w:ascii="Courier New" w:hAnsi="Courier New" w:cs="Courier New" w:hint="default"/>
+      </w:rPr>
+    </w:lvl>
+    <w:lvl w:ilvl="8" w:tplc="10090005" w:tentative="1">
+      <w:start w:val="1"/>
+      <w:numFmt w:val="bullet"/>
+      <w:lvlText w:val=""/>
+      <w:lvlJc w:val="left"/>
+      <w:pPr>
+        <w:ind w:left="7200" w:hanging="360"/>
+      </w:pPr>
+      <w:rPr>
+        <w:rFonts w:ascii="Wingdings" w:hAnsi="Wingdings" w:hint="default"/>
+      </w:rPr>
+    </w:lvl>
+  </w:abstractNum>
+  <w:abstractNum w:abstractNumId="4" w15:restartNumberingAfterBreak="0">
+    <w:nsid w:val="1CA93C3A"/>
+    <w:multiLevelType w:val="hybridMultilevel"/>
+    <w:tmpl w:val="F894099A"/>
+    <w:lvl w:ilvl="0" w:tplc="E500BC50">
+      <w:numFmt w:val="bullet"/>
+      <w:lvlText w:val="-"/>
+      <w:lvlJc w:val="left"/>
+      <w:pPr>
+        <w:ind w:left="720" w:hanging="360"/>
+      </w:pPr>
+      <w:rPr>
+        <w:rFonts w:ascii="Aptos" w:eastAsiaTheme="minorHAnsi" w:hAnsi="Aptos" w:cstheme="minorBidi" w:hint="default"/>
+      </w:rPr>
+    </w:lvl>
+    <w:lvl w:ilvl="1" w:tplc="10090003">
+      <w:start w:val="1"/>
+      <w:numFmt w:val="bullet"/>
+      <w:lvlText w:val="o"/>
+      <w:lvlJc w:val="left"/>
+      <w:pPr>
+        <w:ind w:left="1440" w:hanging="360"/>
+      </w:pPr>
+      <w:rPr>
+        <w:rFonts w:ascii="Courier New" w:hAnsi="Courier New" w:cs="Courier New" w:hint="default"/>
+      </w:rPr>
+    </w:lvl>
+    <w:lvl w:ilvl="2" w:tplc="10090005">
+      <w:start w:val="1"/>
+      <w:numFmt w:val="bullet"/>
+      <w:lvlText w:val=""/>
+      <w:lvlJc w:val="left"/>
+      <w:pPr>
+        <w:ind w:left="2160" w:hanging="360"/>
+      </w:pPr>
+      <w:rPr>
+        <w:rFonts w:ascii="Wingdings" w:hAnsi="Wingdings" w:hint="default"/>
+      </w:rPr>
+    </w:lvl>
+    <w:lvl w:ilvl="3" w:tplc="10090001">
+      <w:start w:val="1"/>
+      <w:numFmt w:val="bullet"/>
+      <w:lvlText w:val=""/>
+      <w:lvlJc w:val="left"/>
+      <w:pPr>
+        <w:ind w:left="2880" w:hanging="360"/>
+      </w:pPr>
+      <w:rPr>
+        <w:rFonts w:ascii="Symbol" w:hAnsi="Symbol" w:hint="default"/>
+      </w:rPr>
+    </w:lvl>
+    <w:lvl w:ilvl="4" w:tplc="10090003" w:tentative="1">
+      <w:start w:val="1"/>
+      <w:numFmt w:val="bullet"/>
+      <w:lvlText w:val="o"/>
+      <w:lvlJc w:val="left"/>
+      <w:pPr>
+        <w:ind w:left="3600" w:hanging="360"/>
+      </w:pPr>
+      <w:rPr>
+        <w:rFonts w:ascii="Courier New" w:hAnsi="Courier New" w:cs="Courier New" w:hint="default"/>
+      </w:rPr>
+    </w:lvl>
+    <w:lvl w:ilvl="5" w:tplc="10090005" w:tentative="1">
+      <w:start w:val="1"/>
+      <w:numFmt w:val="bullet"/>
+      <w:lvlText w:val=""/>
+      <w:lvlJc w:val="left"/>
+      <w:pPr>
+        <w:ind w:left="4320" w:hanging="360"/>
+      </w:pPr>
+      <w:rPr>
+        <w:rFonts w:ascii="Wingdings" w:hAnsi="Wingdings" w:hint="default"/>
+      </w:rPr>
+    </w:lvl>
+    <w:lvl w:ilvl="6" w:tplc="10090001" w:tentative="1">
+      <w:start w:val="1"/>
+      <w:numFmt w:val="bullet"/>
+      <w:lvlText w:val=""/>
+      <w:lvlJc w:val="left"/>
+      <w:pPr>
+        <w:ind w:left="5040" w:hanging="360"/>
+      </w:pPr>
+      <w:rPr>
+        <w:rFonts w:ascii="Symbol" w:hAnsi="Symbol" w:hint="default"/>
+      </w:rPr>
+    </w:lvl>
+    <w:lvl w:ilvl="7" w:tplc="10090003" w:tentative="1">
+      <w:start w:val="1"/>
+      <w:numFmt w:val="bullet"/>
+      <w:lvlText w:val="o"/>
+      <w:lvlJc w:val="left"/>
+      <w:pPr>
+        <w:ind w:left="5760" w:hanging="360"/>
+      </w:pPr>
+      <w:rPr>
+        <w:rFonts w:ascii="Courier New" w:hAnsi="Courier New" w:cs="Courier New" w:hint="default"/>
+      </w:rPr>
+    </w:lvl>
+    <w:lvl w:ilvl="8" w:tplc="10090005" w:tentative="1">
+      <w:start w:val="1"/>
+      <w:numFmt w:val="bullet"/>
+      <w:lvlText w:val=""/>
+      <w:lvlJc w:val="left"/>
+      <w:pPr>
+        <w:ind w:left="6480" w:hanging="360"/>
+      </w:pPr>
+      <w:rPr>
+        <w:rFonts w:ascii="Wingdings" w:hAnsi="Wingdings" w:hint="default"/>
+      </w:rPr>
+    </w:lvl>
+  </w:abstractNum>
+  <w:abstractNum w:abstractNumId="5" w15:restartNumberingAfterBreak="0">
+    <w:nsid w:val="238552C2"/>
+    <w:multiLevelType w:val="hybridMultilevel"/>
+    <w:tmpl w:val="451CAE48"/>
+    <w:lvl w:ilvl="0" w:tplc="E500BC50">
+      <w:numFmt w:val="bullet"/>
+      <w:lvlText w:val="-"/>
+      <w:lvlJc w:val="left"/>
+      <w:pPr>
+        <w:ind w:left="720" w:hanging="360"/>
+      </w:pPr>
+      <w:rPr>
+        <w:rFonts w:ascii="Aptos" w:eastAsiaTheme="minorHAnsi" w:hAnsi="Aptos" w:cstheme="minorBidi" w:hint="default"/>
+      </w:rPr>
+    </w:lvl>
+    <w:lvl w:ilvl="1" w:tplc="10090003" w:tentative="1">
+      <w:start w:val="1"/>
+      <w:numFmt w:val="bullet"/>
+      <w:lvlText w:val="o"/>
+      <w:lvlJc w:val="left"/>
+      <w:pPr>
+        <w:ind w:left="1440" w:hanging="360"/>
+      </w:pPr>
+      <w:rPr>
+        <w:rFonts w:ascii="Courier New" w:hAnsi="Courier New" w:cs="Courier New" w:hint="default"/>
+      </w:rPr>
+    </w:lvl>
+    <w:lvl w:ilvl="2" w:tplc="10090005" w:tentative="1">
+      <w:start w:val="1"/>
+      <w:numFmt w:val="bullet"/>
+      <w:lvlText w:val=""/>
+      <w:lvlJc w:val="left"/>
+      <w:pPr>
+        <w:ind w:left="2160" w:hanging="360"/>
+      </w:pPr>
+      <w:rPr>
+        <w:rFonts w:ascii="Wingdings" w:hAnsi="Wingdings" w:hint="default"/>
+      </w:rPr>
+    </w:lvl>
+    <w:lvl w:ilvl="3" w:tplc="10090001" w:tentative="1">
+      <w:start w:val="1"/>
+      <w:numFmt w:val="bullet"/>
+      <w:lvlText w:val=""/>
+      <w:lvlJc w:val="left"/>
+      <w:pPr>
+        <w:ind w:left="2880" w:hanging="360"/>
+      </w:pPr>
+      <w:rPr>
+        <w:rFonts w:ascii="Symbol" w:hAnsi="Symbol" w:hint="default"/>
+      </w:rPr>
+    </w:lvl>
+    <w:lvl w:ilvl="4" w:tplc="10090003" w:tentative="1">
+      <w:start w:val="1"/>
+      <w:numFmt w:val="bullet"/>
+      <w:lvlText w:val="o"/>
+      <w:lvlJc w:val="left"/>
+      <w:pPr>
+        <w:ind w:left="3600" w:hanging="360"/>
+      </w:pPr>
+      <w:rPr>
+        <w:rFonts w:ascii="Courier New" w:hAnsi="Courier New" w:cs="Courier New" w:hint="default"/>
+      </w:rPr>
+    </w:lvl>
+    <w:lvl w:ilvl="5" w:tplc="10090005" w:tentative="1">
+      <w:start w:val="1"/>
+      <w:numFmt w:val="bullet"/>
+      <w:lvlText w:val=""/>
+      <w:lvlJc w:val="left"/>
+      <w:pPr>
+        <w:ind w:left="4320" w:hanging="360"/>
+      </w:pPr>
+      <w:rPr>
+        <w:rFonts w:ascii="Wingdings" w:hAnsi="Wingdings" w:hint="default"/>
+      </w:rPr>
+    </w:lvl>
+    <w:lvl w:ilvl="6" w:tplc="10090001" w:tentative="1">
+      <w:start w:val="1"/>
+      <w:numFmt w:val="bullet"/>
+      <w:lvlText w:val=""/>
+      <w:lvlJc w:val="left"/>
+      <w:pPr>
+        <w:ind w:left="5040" w:hanging="360"/>
+      </w:pPr>
+      <w:rPr>
+        <w:rFonts w:ascii="Symbol" w:hAnsi="Symbol" w:hint="default"/>
+      </w:rPr>
+    </w:lvl>
+    <w:lvl w:ilvl="7" w:tplc="10090003" w:tentative="1">
+      <w:start w:val="1"/>
+      <w:numFmt w:val="bullet"/>
+      <w:lvlText w:val="o"/>
+      <w:lvlJc w:val="left"/>
+      <w:pPr>
+        <w:ind w:left="5760" w:hanging="360"/>
+      </w:pPr>
+      <w:rPr>
+        <w:rFonts w:ascii="Courier New" w:hAnsi="Courier New" w:cs="Courier New" w:hint="default"/>
+      </w:rPr>
+    </w:lvl>
+    <w:lvl w:ilvl="8" w:tplc="10090005" w:tentative="1">
+      <w:start w:val="1"/>
+      <w:numFmt w:val="bullet"/>
+      <w:lvlText w:val=""/>
+      <w:lvlJc w:val="left"/>
+      <w:pPr>
+        <w:ind w:left="6480" w:hanging="360"/>
+      </w:pPr>
+      <w:rPr>
+        <w:rFonts w:ascii="Wingdings" w:hAnsi="Wingdings" w:hint="default"/>
+      </w:rPr>
+    </w:lvl>
+  </w:abstractNum>
+  <w:abstractNum w:abstractNumId="6" w15:restartNumberingAfterBreak="0">
+    <w:nsid w:val="2D1B16FF"/>
+    <w:multiLevelType w:val="hybridMultilevel"/>
+    <w:tmpl w:val="C3B2215E"/>
+    <w:lvl w:ilvl="0" w:tplc="E500BC50">
+      <w:numFmt w:val="bullet"/>
+      <w:lvlText w:val="-"/>
+      <w:lvlJc w:val="left"/>
+      <w:pPr>
+        <w:ind w:left="720" w:hanging="360"/>
+      </w:pPr>
+      <w:rPr>
+        <w:rFonts w:ascii="Aptos" w:eastAsiaTheme="minorHAnsi" w:hAnsi="Aptos" w:cstheme="minorBidi" w:hint="default"/>
+      </w:rPr>
+    </w:lvl>
+    <w:lvl w:ilvl="1" w:tplc="10090003" w:tentative="1">
+      <w:start w:val="1"/>
+      <w:numFmt w:val="bullet"/>
+      <w:lvlText w:val="o"/>
+      <w:lvlJc w:val="left"/>
+      <w:pPr>
+        <w:ind w:left="1440" w:hanging="360"/>
+      </w:pPr>
+      <w:rPr>
+        <w:rFonts w:ascii="Courier New" w:hAnsi="Courier New" w:cs="Courier New" w:hint="default"/>
+      </w:rPr>
+    </w:lvl>
+    <w:lvl w:ilvl="2" w:tplc="10090005" w:tentative="1">
+      <w:start w:val="1"/>
+      <w:numFmt w:val="bullet"/>
+      <w:lvlText w:val=""/>
+      <w:lvlJc w:val="left"/>
+      <w:pPr>
+        <w:ind w:left="2160" w:hanging="360"/>
+      </w:pPr>
+      <w:rPr>
+        <w:rFonts w:ascii="Wingdings" w:hAnsi="Wingdings" w:hint="default"/>
+      </w:rPr>
+    </w:lvl>
+    <w:lvl w:ilvl="3" w:tplc="10090001" w:tentative="1">
+      <w:start w:val="1"/>
+      <w:numFmt w:val="bullet"/>
+      <w:lvlText w:val=""/>
+      <w:lvlJc w:val="left"/>
+      <w:pPr>
+        <w:ind w:left="2880" w:hanging="360"/>
+      </w:pPr>
+      <w:rPr>
+        <w:rFonts w:ascii="Symbol" w:hAnsi="Symbol" w:hint="default"/>
+      </w:rPr>
+    </w:lvl>
+    <w:lvl w:ilvl="4" w:tplc="10090003" w:tentative="1">
+      <w:start w:val="1"/>
+      <w:numFmt w:val="bullet"/>
+      <w:lvlText w:val="o"/>
+      <w:lvlJc w:val="left"/>
+      <w:pPr>
+        <w:ind w:left="3600" w:hanging="360"/>
+      </w:pPr>
+      <w:rPr>
+        <w:rFonts w:ascii="Courier New" w:hAnsi="Courier New" w:cs="Courier New" w:hint="default"/>
+      </w:rPr>
+    </w:lvl>
+    <w:lvl w:ilvl="5" w:tplc="10090005" w:tentative="1">
+      <w:start w:val="1"/>
+      <w:numFmt w:val="bullet"/>
+      <w:lvlText w:val=""/>
+      <w:lvlJc w:val="left"/>
+      <w:pPr>
+        <w:ind w:left="4320" w:hanging="360"/>
+      </w:pPr>
+      <w:rPr>
+        <w:rFonts w:ascii="Wingdings" w:hAnsi="Wingdings" w:hint="default"/>
+      </w:rPr>
+    </w:lvl>
+    <w:lvl w:ilvl="6" w:tplc="10090001" w:tentative="1">
+      <w:start w:val="1"/>
+      <w:numFmt w:val="bullet"/>
+      <w:lvlText w:val=""/>
+      <w:lvlJc w:val="left"/>
+      <w:pPr>
+        <w:ind w:left="5040" w:hanging="360"/>
+      </w:pPr>
+      <w:rPr>
+        <w:rFonts w:ascii="Symbol" w:hAnsi="Symbol" w:hint="default"/>
+      </w:rPr>
+    </w:lvl>
+    <w:lvl w:ilvl="7" w:tplc="10090003" w:tentative="1">
+      <w:start w:val="1"/>
+      <w:numFmt w:val="bullet"/>
+      <w:lvlText w:val="o"/>
+      <w:lvlJc w:val="left"/>
+      <w:pPr>
+        <w:ind w:left="5760" w:hanging="360"/>
+      </w:pPr>
+      <w:rPr>
+        <w:rFonts w:ascii="Courier New" w:hAnsi="Courier New" w:cs="Courier New" w:hint="default"/>
+      </w:rPr>
+    </w:lvl>
+    <w:lvl w:ilvl="8" w:tplc="10090005" w:tentative="1">
+      <w:start w:val="1"/>
+      <w:numFmt w:val="bullet"/>
+      <w:lvlText w:val=""/>
+      <w:lvlJc w:val="left"/>
+      <w:pPr>
+        <w:ind w:left="6480" w:hanging="360"/>
+      </w:pPr>
+      <w:rPr>
+        <w:rFonts w:ascii="Wingdings" w:hAnsi="Wingdings" w:hint="default"/>
+      </w:rPr>
+    </w:lvl>
+  </w:abstractNum>
+  <w:abstractNum w:abstractNumId="7" w15:restartNumberingAfterBreak="0">
+    <w:nsid w:val="430B3D77"/>
+    <w:multiLevelType w:val="hybridMultilevel"/>
+    <w:tmpl w:val="5BF88BC0"/>
+    <w:lvl w:ilvl="0" w:tplc="10090001">
+      <w:start w:val="1"/>
+      <w:numFmt w:val="bullet"/>
+      <w:lvlText w:val=""/>
+      <w:lvlJc w:val="left"/>
+      <w:pPr>
+        <w:ind w:left="720" w:hanging="360"/>
+      </w:pPr>
+      <w:rPr>
+        <w:rFonts w:ascii="Symbol" w:hAnsi="Symbol" w:hint="default"/>
+      </w:rPr>
+    </w:lvl>
+    <w:lvl w:ilvl="1" w:tplc="10090003" w:tentative="1">
+      <w:start w:val="1"/>
+      <w:numFmt w:val="bullet"/>
+      <w:lvlText w:val="o"/>
+      <w:lvlJc w:val="left"/>
+      <w:pPr>
+        <w:ind w:left="1440" w:hanging="360"/>
+      </w:pPr>
+      <w:rPr>
+        <w:rFonts w:ascii="Courier New" w:hAnsi="Courier New" w:cs="Courier New" w:hint="default"/>
+      </w:rPr>
+    </w:lvl>
+    <w:lvl w:ilvl="2" w:tplc="10090005" w:tentative="1">
+      <w:start w:val="1"/>
+      <w:numFmt w:val="bullet"/>
+      <w:lvlText w:val=""/>
+      <w:lvlJc w:val="left"/>
+      <w:pPr>
+        <w:ind w:left="2160" w:hanging="360"/>
+      </w:pPr>
+      <w:rPr>
+        <w:rFonts w:ascii="Wingdings" w:hAnsi="Wingdings" w:hint="default"/>
+      </w:rPr>
+    </w:lvl>
+    <w:lvl w:ilvl="3" w:tplc="10090001" w:tentative="1">
+      <w:start w:val="1"/>
+      <w:numFmt w:val="bullet"/>
+      <w:lvlText w:val=""/>
+      <w:lvlJc w:val="left"/>
+      <w:pPr>
+        <w:ind w:left="2880" w:hanging="360"/>
+      </w:pPr>
+      <w:rPr>
+        <w:rFonts w:ascii="Symbol" w:hAnsi="Symbol" w:hint="default"/>
+      </w:rPr>
+    </w:lvl>
+    <w:lvl w:ilvl="4" w:tplc="10090003" w:tentative="1">
+      <w:start w:val="1"/>
+      <w:numFmt w:val="bullet"/>
+      <w:lvlText w:val="o"/>
+      <w:lvlJc w:val="left"/>
+      <w:pPr>
+        <w:ind w:left="3600" w:hanging="360"/>
+      </w:pPr>
+      <w:rPr>
+        <w:rFonts w:ascii="Courier New" w:hAnsi="Courier New" w:cs="Courier New" w:hint="default"/>
+      </w:rPr>
+    </w:lvl>
+    <w:lvl w:ilvl="5" w:tplc="10090005" w:tentative="1">
+      <w:start w:val="1"/>
+      <w:numFmt w:val="bullet"/>
+      <w:lvlText w:val=""/>
+      <w:lvlJc w:val="left"/>
+      <w:pPr>
+        <w:ind w:left="4320" w:hanging="360"/>
+      </w:pPr>
+      <w:rPr>
+        <w:rFonts w:ascii="Wingdings" w:hAnsi="Wingdings" w:hint="default"/>
+      </w:rPr>
+    </w:lvl>
+    <w:lvl w:ilvl="6" w:tplc="10090001" w:tentative="1">
+      <w:start w:val="1"/>
+      <w:numFmt w:val="bullet"/>
+      <w:lvlText w:val=""/>
+      <w:lvlJc w:val="left"/>
+      <w:pPr>
+        <w:ind w:left="5040" w:hanging="360"/>
+      </w:pPr>
+      <w:rPr>
+        <w:rFonts w:ascii="Symbol" w:hAnsi="Symbol" w:hint="default"/>
+      </w:rPr>
+    </w:lvl>
+    <w:lvl w:ilvl="7" w:tplc="10090003" w:tentative="1">
+      <w:start w:val="1"/>
+      <w:numFmt w:val="bullet"/>
+      <w:lvlText w:val="o"/>
+      <w:lvlJc w:val="left"/>
+      <w:pPr>
+        <w:ind w:left="5760" w:hanging="360"/>
+      </w:pPr>
+      <w:rPr>
+        <w:rFonts w:ascii="Courier New" w:hAnsi="Courier New" w:cs="Courier New" w:hint="default"/>
+      </w:rPr>
+    </w:lvl>
+    <w:lvl w:ilvl="8" w:tplc="10090005" w:tentative="1">
+      <w:start w:val="1"/>
+      <w:numFmt w:val="bullet"/>
+      <w:lvlText w:val=""/>
+      <w:lvlJc w:val="left"/>
+      <w:pPr>
+        <w:ind w:left="6480" w:hanging="360"/>
+      </w:pPr>
+      <w:rPr>
+        <w:rFonts w:ascii="Wingdings" w:hAnsi="Wingdings" w:hint="default"/>
+      </w:rPr>
+    </w:lvl>
+  </w:abstractNum>
+  <w:abstractNum w:abstractNumId="8" w15:restartNumberingAfterBreak="0">
+    <w:nsid w:val="4EFA165B"/>
+    <w:multiLevelType w:val="hybridMultilevel"/>
+    <w:tmpl w:val="87622E42"/>
+    <w:lvl w:ilvl="0" w:tplc="E500BC50">
+      <w:numFmt w:val="bullet"/>
+      <w:lvlText w:val="-"/>
+      <w:lvlJc w:val="left"/>
+      <w:pPr>
+        <w:ind w:left="720" w:hanging="360"/>
+      </w:pPr>
+      <w:rPr>
+        <w:rFonts w:ascii="Aptos" w:eastAsiaTheme="minorHAnsi" w:hAnsi="Aptos" w:cstheme="minorBidi" w:hint="default"/>
+      </w:rPr>
+    </w:lvl>
+    <w:lvl w:ilvl="1" w:tplc="10090003" w:tentative="1">
+      <w:start w:val="1"/>
+      <w:numFmt w:val="bullet"/>
+      <w:lvlText w:val="o"/>
+      <w:lvlJc w:val="left"/>
+      <w:pPr>
+        <w:ind w:left="1440" w:hanging="360"/>
+      </w:pPr>
+      <w:rPr>
+        <w:rFonts w:ascii="Courier New" w:hAnsi="Courier New" w:cs="Courier New" w:hint="default"/>
+      </w:rPr>
+    </w:lvl>
+    <w:lvl w:ilvl="2" w:tplc="10090005" w:tentative="1">
+      <w:start w:val="1"/>
+      <w:numFmt w:val="bullet"/>
+      <w:lvlText w:val=""/>
+      <w:lvlJc w:val="left"/>
+      <w:pPr>
+        <w:ind w:left="2160" w:hanging="360"/>
+      </w:pPr>
+      <w:rPr>
+        <w:rFonts w:ascii="Wingdings" w:hAnsi="Wingdings" w:hint="default"/>
+      </w:rPr>
+    </w:lvl>
+    <w:lvl w:ilvl="3" w:tplc="10090001" w:tentative="1">
+      <w:start w:val="1"/>
+      <w:numFmt w:val="bullet"/>
+      <w:lvlText w:val=""/>
+      <w:lvlJc w:val="left"/>
+      <w:pPr>
+        <w:ind w:left="2880" w:hanging="360"/>
+      </w:pPr>
+      <w:rPr>
+        <w:rFonts w:ascii="Symbol" w:hAnsi="Symbol" w:hint="default"/>
+      </w:rPr>
+    </w:lvl>
+    <w:lvl w:ilvl="4" w:tplc="10090003" w:tentative="1">
+      <w:start w:val="1"/>
+      <w:numFmt w:val="bullet"/>
+      <w:lvlText w:val="o"/>
+      <w:lvlJc w:val="left"/>
+      <w:pPr>
+        <w:ind w:left="3600" w:hanging="360"/>
+      </w:pPr>
+      <w:rPr>
+        <w:rFonts w:ascii="Courier New" w:hAnsi="Courier New" w:cs="Courier New" w:hint="default"/>
+      </w:rPr>
+    </w:lvl>
+    <w:lvl w:ilvl="5" w:tplc="10090005" w:tentative="1">
+      <w:start w:val="1"/>
+      <w:numFmt w:val="bullet"/>
+      <w:lvlText w:val=""/>
+      <w:lvlJc w:val="left"/>
+      <w:pPr>
+        <w:ind w:left="4320" w:hanging="360"/>
+      </w:pPr>
+      <w:rPr>
+        <w:rFonts w:ascii="Wingdings" w:hAnsi="Wingdings" w:hint="default"/>
+      </w:rPr>
+    </w:lvl>
+    <w:lvl w:ilvl="6" w:tplc="10090001" w:tentative="1">
+      <w:start w:val="1"/>
+      <w:numFmt w:val="bullet"/>
+      <w:lvlText w:val=""/>
+      <w:lvlJc w:val="left"/>
+      <w:pPr>
+        <w:ind w:left="5040" w:hanging="360"/>
+      </w:pPr>
+      <w:rPr>
+        <w:rFonts w:ascii="Symbol" w:hAnsi="Symbol" w:hint="default"/>
+      </w:rPr>
+    </w:lvl>
+    <w:lvl w:ilvl="7" w:tplc="10090003" w:tentative="1">
+      <w:start w:val="1"/>
+      <w:numFmt w:val="bullet"/>
+      <w:lvlText w:val="o"/>
+      <w:lvlJc w:val="left"/>
+      <w:pPr>
+        <w:ind w:left="5760" w:hanging="360"/>
+      </w:pPr>
+      <w:rPr>
+        <w:rFonts w:ascii="Courier New" w:hAnsi="Courier New" w:cs="Courier New" w:hint="default"/>
+      </w:rPr>
+    </w:lvl>
+    <w:lvl w:ilvl="8" w:tplc="10090005" w:tentative="1">
+      <w:start w:val="1"/>
+      <w:numFmt w:val="bullet"/>
+      <w:lvlText w:val=""/>
+      <w:lvlJc w:val="left"/>
+      <w:pPr>
+        <w:ind w:left="6480" w:hanging="360"/>
+      </w:pPr>
+      <w:rPr>
+        <w:rFonts w:ascii="Wingdings" w:hAnsi="Wingdings" w:hint="default"/>
+      </w:rPr>
+    </w:lvl>
+  </w:abstractNum>
+  <w:abstractNum w:abstractNumId="9" w15:restartNumberingAfterBreak="0">
+    <w:nsid w:val="52430960"/>
+    <w:multiLevelType w:val="hybridMultilevel"/>
+    <w:tmpl w:val="91027FB0"/>
+    <w:lvl w:ilvl="0" w:tplc="E500BC50">
+      <w:numFmt w:val="bullet"/>
+      <w:lvlText w:val="-"/>
+      <w:lvlJc w:val="left"/>
+      <w:pPr>
+        <w:ind w:left="720" w:hanging="360"/>
+      </w:pPr>
+      <w:rPr>
+        <w:rFonts w:ascii="Aptos" w:eastAsiaTheme="minorHAnsi" w:hAnsi="Aptos" w:cstheme="minorBidi" w:hint="default"/>
+      </w:rPr>
+    </w:lvl>
+    <w:lvl w:ilvl="1" w:tplc="10090003" w:tentative="1">
+      <w:start w:val="1"/>
+      <w:numFmt w:val="bullet"/>
+      <w:lvlText w:val="o"/>
+      <w:lvlJc w:val="left"/>
+      <w:pPr>
+        <w:ind w:left="1440" w:hanging="360"/>
+      </w:pPr>
+      <w:rPr>
+        <w:rFonts w:ascii="Courier New" w:hAnsi="Courier New" w:cs="Courier New" w:hint="default"/>
+      </w:rPr>
+    </w:lvl>
+    <w:lvl w:ilvl="2" w:tplc="10090005" w:tentative="1">
+      <w:start w:val="1"/>
+      <w:numFmt w:val="bullet"/>
+      <w:lvlText w:val=""/>
+      <w:lvlJc w:val="left"/>
+      <w:pPr>
+        <w:ind w:left="2160" w:hanging="360"/>
+      </w:pPr>
+      <w:rPr>
+        <w:rFonts w:ascii="Wingdings" w:hAnsi="Wingdings" w:hint="default"/>
+      </w:rPr>
+    </w:lvl>
+    <w:lvl w:ilvl="3" w:tplc="10090001" w:tentative="1">
+      <w:start w:val="1"/>
+      <w:numFmt w:val="bullet"/>
+      <w:lvlText w:val=""/>
+      <w:lvlJc w:val="left"/>
+      <w:pPr>
+        <w:ind w:left="2880" w:hanging="360"/>
+      </w:pPr>
+      <w:rPr>
+        <w:rFonts w:ascii="Symbol" w:hAnsi="Symbol" w:hint="default"/>
+      </w:rPr>
+    </w:lvl>
+    <w:lvl w:ilvl="4" w:tplc="10090003" w:tentative="1">
+      <w:start w:val="1"/>
+      <w:numFmt w:val="bullet"/>
+      <w:lvlText w:val="o"/>
+      <w:lvlJc w:val="left"/>
+      <w:pPr>
+        <w:ind w:left="3600" w:hanging="360"/>
+      </w:pPr>
+      <w:rPr>
+        <w:rFonts w:ascii="Courier New" w:hAnsi="Courier New" w:cs="Courier New" w:hint="default"/>
+      </w:rPr>
+    </w:lvl>
+    <w:lvl w:ilvl="5" w:tplc="10090005" w:tentative="1">
+      <w:start w:val="1"/>
+      <w:numFmt w:val="bullet"/>
+      <w:lvlText w:val=""/>
+      <w:lvlJc w:val="left"/>
+      <w:pPr>
+        <w:ind w:left="4320" w:hanging="360"/>
+      </w:pPr>
+      <w:rPr>
+        <w:rFonts w:ascii="Wingdings" w:hAnsi="Wingdings" w:hint="default"/>
+      </w:rPr>
+    </w:lvl>
+    <w:lvl w:ilvl="6" w:tplc="10090001" w:tentative="1">
+      <w:start w:val="1"/>
+      <w:numFmt w:val="bullet"/>
+      <w:lvlText w:val=""/>
+      <w:lvlJc w:val="left"/>
+      <w:pPr>
+        <w:ind w:left="5040" w:hanging="360"/>
+      </w:pPr>
+      <w:rPr>
+        <w:rFonts w:ascii="Symbol" w:hAnsi="Symbol" w:hint="default"/>
+      </w:rPr>
+    </w:lvl>
+    <w:lvl w:ilvl="7" w:tplc="10090003" w:tentative="1">
+      <w:start w:val="1"/>
+      <w:numFmt w:val="bullet"/>
+      <w:lvlText w:val="o"/>
+      <w:lvlJc w:val="left"/>
+      <w:pPr>
+        <w:ind w:left="5760" w:hanging="360"/>
+      </w:pPr>
+      <w:rPr>
+        <w:rFonts w:ascii="Courier New" w:hAnsi="Courier New" w:cs="Courier New" w:hint="default"/>
+      </w:rPr>
+    </w:lvl>
+    <w:lvl w:ilvl="8" w:tplc="10090005" w:tentative="1">
+      <w:start w:val="1"/>
+      <w:numFmt w:val="bullet"/>
+      <w:lvlText w:val=""/>
+      <w:lvlJc w:val="left"/>
+      <w:pPr>
+        <w:ind w:left="6480" w:hanging="360"/>
+      </w:pPr>
+      <w:rPr>
+        <w:rFonts w:ascii="Wingdings" w:hAnsi="Wingdings" w:hint="default"/>
+      </w:rPr>
+    </w:lvl>
+  </w:abstractNum>
+  <w:abstractNum w:abstractNumId="10" w15:restartNumberingAfterBreak="0">
+    <w:nsid w:val="5CDE7ADD"/>
+    <w:multiLevelType w:val="hybridMultilevel"/>
+    <w:tmpl w:val="6480143E"/>
+    <w:lvl w:ilvl="0" w:tplc="E500BC50">
+      <w:numFmt w:val="bullet"/>
+      <w:lvlText w:val="-"/>
+      <w:lvlJc w:val="left"/>
+      <w:pPr>
+        <w:ind w:left="720" w:hanging="360"/>
+      </w:pPr>
+      <w:rPr>
+        <w:rFonts w:ascii="Aptos" w:eastAsiaTheme="minorHAnsi" w:hAnsi="Aptos" w:cstheme="minorBidi" w:hint="default"/>
+      </w:rPr>
+    </w:lvl>
+    <w:lvl w:ilvl="1" w:tplc="10090003" w:tentative="1">
+      <w:start w:val="1"/>
+      <w:numFmt w:val="bullet"/>
+      <w:lvlText w:val="o"/>
+      <w:lvlJc w:val="left"/>
+      <w:pPr>
+        <w:ind w:left="1440" w:hanging="360"/>
+      </w:pPr>
+      <w:rPr>
+        <w:rFonts w:ascii="Courier New" w:hAnsi="Courier New" w:cs="Courier New" w:hint="default"/>
+      </w:rPr>
+    </w:lvl>
+    <w:lvl w:ilvl="2" w:tplc="10090005" w:tentative="1">
+      <w:start w:val="1"/>
+      <w:numFmt w:val="bullet"/>
+      <w:lvlText w:val=""/>
+      <w:lvlJc w:val="left"/>
+      <w:pPr>
+        <w:ind w:left="2160" w:hanging="360"/>
+      </w:pPr>
+      <w:rPr>
+        <w:rFonts w:ascii="Wingdings" w:hAnsi="Wingdings" w:hint="default"/>
+      </w:rPr>
+    </w:lvl>
+    <w:lvl w:ilvl="3" w:tplc="10090001" w:tentative="1">
+      <w:start w:val="1"/>
+      <w:numFmt w:val="bullet"/>
+      <w:lvlText w:val=""/>
+      <w:lvlJc w:val="left"/>
+      <w:pPr>
+        <w:ind w:left="2880" w:hanging="360"/>
+      </w:pPr>
+      <w:rPr>
+        <w:rFonts w:ascii="Symbol" w:hAnsi="Symbol" w:hint="default"/>
+      </w:rPr>
+    </w:lvl>
+    <w:lvl w:ilvl="4" w:tplc="10090003" w:tentative="1">
+      <w:start w:val="1"/>
+      <w:numFmt w:val="bullet"/>
+      <w:lvlText w:val="o"/>
+      <w:lvlJc w:val="left"/>
+      <w:pPr>
+        <w:ind w:left="3600" w:hanging="360"/>
+      </w:pPr>
+      <w:rPr>
+        <w:rFonts w:ascii="Courier New" w:hAnsi="Courier New" w:cs="Courier New" w:hint="default"/>
+      </w:rPr>
+    </w:lvl>
+    <w:lvl w:ilvl="5" w:tplc="10090005" w:tentative="1">
+      <w:start w:val="1"/>
+      <w:numFmt w:val="bullet"/>
+      <w:lvlText w:val=""/>
+      <w:lvlJc w:val="left"/>
+      <w:pPr>
+        <w:ind w:left="4320" w:hanging="360"/>
+      </w:pPr>
+      <w:rPr>
+        <w:rFonts w:ascii="Wingdings" w:hAnsi="Wingdings" w:hint="default"/>
+      </w:rPr>
+    </w:lvl>
+    <w:lvl w:ilvl="6" w:tplc="10090001" w:tentative="1">
+      <w:start w:val="1"/>
+      <w:numFmt w:val="bullet"/>
+      <w:lvlText w:val=""/>
+      <w:lvlJc w:val="left"/>
+      <w:pPr>
+        <w:ind w:left="5040" w:hanging="360"/>
+      </w:pPr>
+      <w:rPr>
+        <w:rFonts w:ascii="Symbol" w:hAnsi="Symbol" w:hint="default"/>
+      </w:rPr>
+    </w:lvl>
+    <w:lvl w:ilvl="7" w:tplc="10090003" w:tentative="1">
+      <w:start w:val="1"/>
+      <w:numFmt w:val="bullet"/>
+      <w:lvlText w:val="o"/>
+      <w:lvlJc w:val="left"/>
+      <w:pPr>
+        <w:ind w:left="5760" w:hanging="360"/>
+      </w:pPr>
+      <w:rPr>
+        <w:rFonts w:ascii="Courier New" w:hAnsi="Courier New" w:cs="Courier New" w:hint="default"/>
+      </w:rPr>
+    </w:lvl>
+    <w:lvl w:ilvl="8" w:tplc="10090005" w:tentative="1">
+      <w:start w:val="1"/>
+      <w:numFmt w:val="bullet"/>
+      <w:lvlText w:val=""/>
+      <w:lvlJc w:val="left"/>
+      <w:pPr>
+        <w:ind w:left="6480" w:hanging="360"/>
+      </w:pPr>
+      <w:rPr>
+        <w:rFonts w:ascii="Wingdings" w:hAnsi="Wingdings" w:hint="default"/>
+      </w:rPr>
+    </w:lvl>
+  </w:abstractNum>
+  <w:abstractNum w:abstractNumId="11" w15:restartNumberingAfterBreak="0">
+    <w:nsid w:val="68B06779"/>
+    <w:multiLevelType w:val="hybridMultilevel"/>
+    <w:tmpl w:val="8F48249E"/>
+    <w:lvl w:ilvl="0" w:tplc="E500BC50">
+      <w:numFmt w:val="bullet"/>
+      <w:lvlText w:val="-"/>
+      <w:lvlJc w:val="left"/>
+      <w:pPr>
+        <w:ind w:left="720" w:hanging="360"/>
+      </w:pPr>
+      <w:rPr>
+        <w:rFonts w:ascii="Aptos" w:eastAsiaTheme="minorHAnsi" w:hAnsi="Aptos" w:cstheme="minorBidi" w:hint="default"/>
+      </w:rPr>
+    </w:lvl>
+    <w:lvl w:ilvl="1" w:tplc="10090003" w:tentative="1">
+      <w:start w:val="1"/>
+      <w:numFmt w:val="bullet"/>
+      <w:lvlText w:val="o"/>
+      <w:lvlJc w:val="left"/>
+      <w:pPr>
+        <w:ind w:left="1440" w:hanging="360"/>
+      </w:pPr>
+      <w:rPr>
+        <w:rFonts w:ascii="Courier New" w:hAnsi="Courier New" w:cs="Courier New" w:hint="default"/>
+      </w:rPr>
+    </w:lvl>
+    <w:lvl w:ilvl="2" w:tplc="10090005" w:tentative="1">
+      <w:start w:val="1"/>
+      <w:numFmt w:val="bullet"/>
+      <w:lvlText w:val=""/>
+      <w:lvlJc w:val="left"/>
+      <w:pPr>
+        <w:ind w:left="2160" w:hanging="360"/>
+      </w:pPr>
+      <w:rPr>
+        <w:rFonts w:ascii="Wingdings" w:hAnsi="Wingdings" w:hint="default"/>
+      </w:rPr>
+    </w:lvl>
+    <w:lvl w:ilvl="3" w:tplc="10090001" w:tentative="1">
+      <w:start w:val="1"/>
+      <w:numFmt w:val="bullet"/>
+      <w:lvlText w:val=""/>
+      <w:lvlJc w:val="left"/>
+      <w:pPr>
+        <w:ind w:left="2880" w:hanging="360"/>
+      </w:pPr>
+      <w:rPr>
+        <w:rFonts w:ascii="Symbol" w:hAnsi="Symbol" w:hint="default"/>
+      </w:rPr>
+    </w:lvl>
+    <w:lvl w:ilvl="4" w:tplc="10090003" w:tentative="1">
+      <w:start w:val="1"/>
+      <w:numFmt w:val="bullet"/>
+      <w:lvlText w:val="o"/>
+      <w:lvlJc w:val="left"/>
+      <w:pPr>
+        <w:ind w:left="3600" w:hanging="360"/>
+      </w:pPr>
+      <w:rPr>
+        <w:rFonts w:ascii="Courier New" w:hAnsi="Courier New" w:cs="Courier New" w:hint="default"/>
+      </w:rPr>
+    </w:lvl>
+    <w:lvl w:ilvl="5" w:tplc="10090005" w:tentative="1">
+      <w:start w:val="1"/>
+      <w:numFmt w:val="bullet"/>
+      <w:lvlText w:val=""/>
+      <w:lvlJc w:val="left"/>
+      <w:pPr>
+        <w:ind w:left="4320" w:hanging="360"/>
+      </w:pPr>
+      <w:rPr>
+        <w:rFonts w:ascii="Wingdings" w:hAnsi="Wingdings" w:hint="default"/>
+      </w:rPr>
+    </w:lvl>
+    <w:lvl w:ilvl="6" w:tplc="10090001" w:tentative="1">
+      <w:start w:val="1"/>
+      <w:numFmt w:val="bullet"/>
+      <w:lvlText w:val=""/>
+      <w:lvlJc w:val="left"/>
+      <w:pPr>
+        <w:ind w:left="5040" w:hanging="360"/>
+      </w:pPr>
+      <w:rPr>
+        <w:rFonts w:ascii="Symbol" w:hAnsi="Symbol" w:hint="default"/>
+      </w:rPr>
+    </w:lvl>
+    <w:lvl w:ilvl="7" w:tplc="10090003" w:tentative="1">
+      <w:start w:val="1"/>
+      <w:numFmt w:val="bullet"/>
+      <w:lvlText w:val="o"/>
+      <w:lvlJc w:val="left"/>
+      <w:pPr>
+        <w:ind w:left="5760" w:hanging="360"/>
+      </w:pPr>
+      <w:rPr>
+        <w:rFonts w:ascii="Courier New" w:hAnsi="Courier New" w:cs="Courier New" w:hint="default"/>
+      </w:rPr>
+    </w:lvl>
+    <w:lvl w:ilvl="8" w:tplc="10090005" w:tentative="1">
+      <w:start w:val="1"/>
+      <w:numFmt w:val="bullet"/>
+      <w:lvlText w:val=""/>
+      <w:lvlJc w:val="left"/>
+      <w:pPr>
+        <w:ind w:left="6480" w:hanging="360"/>
+      </w:pPr>
+      <w:rPr>
+        <w:rFonts w:ascii="Wingdings" w:hAnsi="Wingdings" w:hint="default"/>
+      </w:rPr>
+    </w:lvl>
+  </w:abstractNum>
+  <w:abstractNum w:abstractNumId="12" w15:restartNumberingAfterBreak="0">
+    <w:nsid w:val="701A61B6"/>
+    <w:multiLevelType w:val="hybridMultilevel"/>
+    <w:tmpl w:val="963E56E0"/>
+    <w:lvl w:ilvl="0" w:tplc="E500BC50">
+      <w:numFmt w:val="bullet"/>
+      <w:lvlText w:val="-"/>
+      <w:lvlJc w:val="left"/>
+      <w:pPr>
+        <w:ind w:left="720" w:hanging="360"/>
+      </w:pPr>
+      <w:rPr>
+        <w:rFonts w:ascii="Aptos" w:eastAsiaTheme="minorHAnsi" w:hAnsi="Aptos" w:cstheme="minorBidi" w:hint="default"/>
+      </w:rPr>
+    </w:lvl>
+    <w:lvl w:ilvl="1" w:tplc="10090003" w:tentative="1">
+      <w:start w:val="1"/>
+      <w:numFmt w:val="bullet"/>
+      <w:lvlText w:val="o"/>
+      <w:lvlJc w:val="left"/>
+      <w:pPr>
+        <w:ind w:left="1440" w:hanging="360"/>
+      </w:pPr>
+      <w:rPr>
+        <w:rFonts w:ascii="Courier New" w:hAnsi="Courier New" w:cs="Courier New" w:hint="default"/>
+      </w:rPr>
+    </w:lvl>
+    <w:lvl w:ilvl="2" w:tplc="10090005" w:tentative="1">
+      <w:start w:val="1"/>
+      <w:numFmt w:val="bullet"/>
+      <w:lvlText w:val=""/>
+      <w:lvlJc w:val="left"/>
+      <w:pPr>
+        <w:ind w:left="2160" w:hanging="360"/>
+      </w:pPr>
+      <w:rPr>
+        <w:rFonts w:ascii="Wingdings" w:hAnsi="Wingdings" w:hint="default"/>
+      </w:rPr>
+    </w:lvl>
+    <w:lvl w:ilvl="3" w:tplc="10090001" w:tentative="1">
+      <w:start w:val="1"/>
+      <w:numFmt w:val="bullet"/>
+      <w:lvlText w:val=""/>
+      <w:lvlJc w:val="left"/>
+      <w:pPr>
+        <w:ind w:left="2880" w:hanging="360"/>
+      </w:pPr>
+      <w:rPr>
+        <w:rFonts w:ascii="Symbol" w:hAnsi="Symbol" w:hint="default"/>
+      </w:rPr>
+    </w:lvl>
+    <w:lvl w:ilvl="4" w:tplc="10090003" w:tentative="1">
+      <w:start w:val="1"/>
+      <w:numFmt w:val="bullet"/>
+      <w:lvlText w:val="o"/>
+      <w:lvlJc w:val="left"/>
+      <w:pPr>
+        <w:ind w:left="3600" w:hanging="360"/>
+      </w:pPr>
+      <w:rPr>
+        <w:rFonts w:ascii="Courier New" w:hAnsi="Courier New" w:cs="Courier New" w:hint="default"/>
+      </w:rPr>
+    </w:lvl>
+    <w:lvl w:ilvl="5" w:tplc="10090005" w:tentative="1">
+      <w:start w:val="1"/>
+      <w:numFmt w:val="bullet"/>
+      <w:lvlText w:val=""/>
+      <w:lvlJc w:val="left"/>
+      <w:pPr>
+        <w:ind w:left="4320" w:hanging="360"/>
+      </w:pPr>
+      <w:rPr>
+        <w:rFonts w:ascii="Wingdings" w:hAnsi="Wingdings" w:hint="default"/>
+      </w:rPr>
+    </w:lvl>
+    <w:lvl w:ilvl="6" w:tplc="10090001" w:tentative="1">
+      <w:start w:val="1"/>
+      <w:numFmt w:val="bullet"/>
+      <w:lvlText w:val=""/>
+      <w:lvlJc w:val="left"/>
+      <w:pPr>
+        <w:ind w:left="5040" w:hanging="360"/>
+      </w:pPr>
+      <w:rPr>
+        <w:rFonts w:ascii="Symbol" w:hAnsi="Symbol" w:hint="default"/>
+      </w:rPr>
+    </w:lvl>
+    <w:lvl w:ilvl="7" w:tplc="10090003" w:tentative="1">
+      <w:start w:val="1"/>
+      <w:numFmt w:val="bullet"/>
+      <w:lvlText w:val="o"/>
+      <w:lvlJc w:val="left"/>
+      <w:pPr>
+        <w:ind w:left="5760" w:hanging="360"/>
+      </w:pPr>
+      <w:rPr>
+        <w:rFonts w:ascii="Courier New" w:hAnsi="Courier New" w:cs="Courier New" w:hint="default"/>
+      </w:rPr>
+    </w:lvl>
+    <w:lvl w:ilvl="8" w:tplc="10090005" w:tentative="1">
+      <w:start w:val="1"/>
+      <w:numFmt w:val="bullet"/>
+      <w:lvlText w:val=""/>
+      <w:lvlJc w:val="left"/>
+      <w:pPr>
+        <w:ind w:left="6480" w:hanging="360"/>
+      </w:pPr>
+      <w:rPr>
+        <w:rFonts w:ascii="Wingdings" w:hAnsi="Wingdings" w:hint="default"/>
+      </w:rPr>
+    </w:lvl>
+  </w:abstractNum>
+  <w:abstractNum w:abstractNumId="13" w15:restartNumberingAfterBreak="0">
+    <w:nsid w:val="7C3D7A52"/>
+    <w:multiLevelType w:val="hybridMultilevel"/>
+    <w:tmpl w:val="CAE09D8C"/>
+    <w:lvl w:ilvl="0" w:tplc="E500BC50">
+      <w:numFmt w:val="bullet"/>
+      <w:lvlText w:val="-"/>
+      <w:lvlJc w:val="left"/>
+      <w:pPr>
+        <w:ind w:left="720" w:hanging="360"/>
+      </w:pPr>
+      <w:rPr>
+        <w:rFonts w:ascii="Aptos" w:eastAsiaTheme="minorHAnsi" w:hAnsi="Aptos" w:cstheme="minorBidi" w:hint="default"/>
+      </w:rPr>
+    </w:lvl>
+    <w:lvl w:ilvl="1" w:tplc="10090003" w:tentative="1">
+      <w:start w:val="1"/>
+      <w:numFmt w:val="bullet"/>
+      <w:lvlText w:val="o"/>
+      <w:lvlJc w:val="left"/>
+      <w:pPr>
+        <w:ind w:left="1440" w:hanging="360"/>
+      </w:pPr>
+      <w:rPr>
+        <w:rFonts w:ascii="Courier New" w:hAnsi="Courier New" w:cs="Courier New" w:hint="default"/>
+      </w:rPr>
+    </w:lvl>
+    <w:lvl w:ilvl="2" w:tplc="10090005" w:tentative="1">
+      <w:start w:val="1"/>
+      <w:numFmt w:val="bullet"/>
+      <w:lvlText w:val=""/>
+      <w:lvlJc w:val="left"/>
+      <w:pPr>
+        <w:ind w:left="2160" w:hanging="360"/>
+      </w:pPr>
+      <w:rPr>
+        <w:rFonts w:ascii="Wingdings" w:hAnsi="Wingdings" w:hint="default"/>
+      </w:rPr>
+    </w:lvl>
+    <w:lvl w:ilvl="3" w:tplc="10090001" w:tentative="1">
+      <w:start w:val="1"/>
+      <w:numFmt w:val="bullet"/>
+      <w:lvlText w:val=""/>
+      <w:lvlJc w:val="left"/>
+      <w:pPr>
+        <w:ind w:left="2880" w:hanging="360"/>
+      </w:pPr>
+      <w:rPr>
+        <w:rFonts w:ascii="Symbol" w:hAnsi="Symbol" w:hint="default"/>
+      </w:rPr>
+    </w:lvl>
+    <w:lvl w:ilvl="4" w:tplc="10090003" w:tentative="1">
+      <w:start w:val="1"/>
+      <w:numFmt w:val="bullet"/>
+      <w:lvlText w:val="o"/>
+      <w:lvlJc w:val="left"/>
+      <w:pPr>
+        <w:ind w:left="3600" w:hanging="360"/>
+      </w:pPr>
+      <w:rPr>
+        <w:rFonts w:ascii="Courier New" w:hAnsi="Courier New" w:cs="Courier New" w:hint="default"/>
+      </w:rPr>
+    </w:lvl>
+    <w:lvl w:ilvl="5" w:tplc="10090005" w:tentative="1">
+      <w:start w:val="1"/>
+      <w:numFmt w:val="bullet"/>
+      <w:lvlText w:val=""/>
+      <w:lvlJc w:val="left"/>
+      <w:pPr>
+        <w:ind w:left="4320" w:hanging="360"/>
+      </w:pPr>
+      <w:rPr>
+        <w:rFonts w:ascii="Wingdings" w:hAnsi="Wingdings" w:hint="default"/>
+      </w:rPr>
+    </w:lvl>
+    <w:lvl w:ilvl="6" w:tplc="10090001" w:tentative="1">
+      <w:start w:val="1"/>
+      <w:numFmt w:val="bullet"/>
+      <w:lvlText w:val=""/>
+      <w:lvlJc w:val="left"/>
+      <w:pPr>
+        <w:ind w:left="5040" w:hanging="360"/>
+      </w:pPr>
+      <w:rPr>
+        <w:rFonts w:ascii="Symbol" w:hAnsi="Symbol" w:hint="default"/>
+      </w:rPr>
+    </w:lvl>
+    <w:lvl w:ilvl="7" w:tplc="10090003" w:tentative="1">
+      <w:start w:val="1"/>
+      <w:numFmt w:val="bullet"/>
+      <w:lvlText w:val="o"/>
+      <w:lvlJc w:val="left"/>
+      <w:pPr>
+        <w:ind w:left="5760" w:hanging="360"/>
+      </w:pPr>
+      <w:rPr>
+        <w:rFonts w:ascii="Courier New" w:hAnsi="Courier New" w:cs="Courier New" w:hint="default"/>
+      </w:rPr>
+    </w:lvl>
+    <w:lvl w:ilvl="8" w:tplc="10090005" w:tentative="1">
+      <w:start w:val="1"/>
+      <w:numFmt w:val="bullet"/>
+      <w:lvlText w:val=""/>
+      <w:lvlJc w:val="left"/>
+      <w:pPr>
+        <w:ind w:left="6480" w:hanging="360"/>
+      </w:pPr>
+      <w:rPr>
+        <w:rFonts w:ascii="Wingdings" w:hAnsi="Wingdings" w:hint="default"/>
+      </w:rPr>
+    </w:lvl>
+  </w:abstractNum>
+  <w:num w:numId="1" w16cid:durableId="458646827">
+    <w:abstractNumId w:val="0"/>
+  </w:num>
+  <w:num w:numId="2" w16cid:durableId="730466032">
+    <w:abstractNumId w:val="7"/>
+  </w:num>
+  <w:num w:numId="3" w16cid:durableId="382337580">
+    <w:abstractNumId w:val="4"/>
+  </w:num>
+  <w:num w:numId="4" w16cid:durableId="596793395">
+    <w:abstractNumId w:val="10"/>
+  </w:num>
+  <w:num w:numId="5" w16cid:durableId="560214205">
+    <w:abstractNumId w:val="13"/>
+  </w:num>
+  <w:num w:numId="6" w16cid:durableId="1682276032">
+    <w:abstractNumId w:val="9"/>
+  </w:num>
+  <w:num w:numId="7" w16cid:durableId="479882311">
+    <w:abstractNumId w:val="5"/>
+  </w:num>
+  <w:num w:numId="8" w16cid:durableId="1108351654">
+    <w:abstractNumId w:val="1"/>
+  </w:num>
+  <w:num w:numId="9" w16cid:durableId="999239603">
+    <w:abstractNumId w:val="3"/>
+  </w:num>
+  <w:num w:numId="10" w16cid:durableId="781270585">
+    <w:abstractNumId w:val="8"/>
+  </w:num>
+  <w:num w:numId="11" w16cid:durableId="998121757">
+    <w:abstractNumId w:val="2"/>
+  </w:num>
+  <w:num w:numId="12" w16cid:durableId="2088305731">
+    <w:abstractNumId w:val="6"/>
+  </w:num>
+  <w:num w:numId="13" w16cid:durableId="881593333">
+    <w:abstractNumId w:val="11"/>
+  </w:num>
+  <w:num w:numId="14" w16cid:durableId="1395349699">
+    <w:abstractNumId w:val="12"/>
+  </w:num>
+</w:numbering>
 </file>
 
 <file path=word/styles.xml><?xml version="1.0" encoding="utf-8"?>
@@ -945,6 +4875,7 @@
   <w:style w:type="character" w:default="1" w:styleId="DefaultParagraphFont">
     <w:name w:val="Default Paragraph Font"/>
     <w:uiPriority w:val="1"/>
+    <w:semiHidden/>
     <w:unhideWhenUsed/>
   </w:style>
   <w:style w:type="table" w:default="1" w:styleId="TableNormal">
@@ -1302,6 +5233,25 @@
     <w:uiPriority w:val="99"/>
     <w:rsid w:val="003D779F"/>
   </w:style>
+  <w:style w:type="table" w:styleId="TableGrid">
+    <w:name w:val="Table Grid"/>
+    <w:basedOn w:val="TableNormal"/>
+    <w:uiPriority w:val="39"/>
+    <w:rsid w:val="0052249F"/>
+    <w:pPr>
+      <w:spacing w:after="0" w:line="240" w:lineRule="auto"/>
+    </w:pPr>
+    <w:tblPr>
+      <w:tblBorders>
+        <w:top w:val="single" w:sz="4" w:space="0" w:color="auto"/>
+        <w:left w:val="single" w:sz="4" w:space="0" w:color="auto"/>
+        <w:bottom w:val="single" w:sz="4" w:space="0" w:color="auto"/>
+        <w:right w:val="single" w:sz="4" w:space="0" w:color="auto"/>
+        <w:insideH w:val="single" w:sz="4" w:space="0" w:color="auto"/>
+        <w:insideV w:val="single" w:sz="4" w:space="0" w:color="auto"/>
+      </w:tblBorders>
+    </w:tblPr>
+  </w:style>
 </w:styles>
 </file>
 

</xml_diff>